<commit_message>
Update DingTalk archive to one output per source record
Flatten each non-empty source record into seven fixed fields and preserve duplicates.
Synchronize node code, synthetic examples, schemas, documentation and tests.
Validate 34 transformation tests, 10 privacy tests and pre-push redaction checks.
</commit_message>
<xml_diff>
--- a/projects/dingtalk-record-transform/使用说明.docx
+++ b/projects/dingtalk-record-transform/使用说明.docx
@@ -7,17 +7,17 @@
         <w:pStyle w:val="Title"/>
       </w:pPr>
       <w:r>
-        <w:t>钉钉多行记录转换使用说明</w:t>
+        <w:t>钉钉记录逐条平铺使用说明</w:t>
       </w:r>
     </w:p>
     <w:p>
       <w:r>
-        <w:t>版本 1.0.0    2026年10月22日</w:t>
+        <w:t>版本 2.0.0    2026年10月22日</w:t>
       </w:r>
     </w:p>
     <w:p>
       <w:r>
-        <w:t>本交付包将钉钉返回的记录列表转换为公司和账号列表，并在每一组内按店铺保存站点及负责人。直接绑定原始列表即可使用，无需打印、解析打印文本或安装第三方模块。</w:t>
+        <w:t>每条有效原始记录生成一个含七个固定字段的字典。公司和店铺信息与站点、负责人位于同一层。相同公司、相同店铺或完全重复的记录分别保留，空 fields 记录跳过。</w:t>
       </w:r>
     </w:p>
     <w:p>
@@ -26,6 +26,1550 @@
       </w:pPr>
       <w:r>
         <w:t>1 选择代码入口</w:t>
+      </w:r>
+    </w:p>
+    <w:tbl>
+      <w:tblPr>
+        <w:tblW w:type="auto" w:w="0"/>
+        <w:tblLayout w:type="fixed"/>
+        <w:tblLook w:firstColumn="1" w:firstRow="1" w:lastColumn="0" w:lastRow="0" w:noHBand="0" w:noVBand="1" w:val="04A0"/>
+      </w:tblPr>
+      <w:tblGrid>
+        <w:gridCol w:w="3118"/>
+        <w:gridCol w:w="6520"/>
+      </w:tblGrid>
+      <w:tr>
+        <w:trPr>
+          <w:tblHeader/>
+        </w:trPr>
+        <w:tc>
+          <w:tcPr>
+            <w:tcW w:type="dxa" w:w="3118"/>
+            <w:vAlign w:val="center"/>
+            <w:tcBorders>
+              <w:top w:val="single" w:sz="4" w:color="D9D9D9"/>
+              <w:left w:val="single" w:sz="4" w:color="D9D9D9"/>
+              <w:bottom w:val="single" w:sz="4" w:color="D9D9D9"/>
+              <w:right w:val="single" w:sz="4" w:color="D9D9D9"/>
+            </w:tcBorders>
+            <w:tcMar>
+              <w:top w:w="85" w:type="dxa"/>
+              <w:left w:w="85" w:type="dxa"/>
+              <w:bottom w:w="85" w:type="dxa"/>
+              <w:right w:w="85" w:type="dxa"/>
+            </w:tcMar>
+            <w:shd w:fill="E8EEF4"/>
+          </w:tcPr>
+          <w:p>
+            <w:pPr>
+              <w:spacing w:before="40" w:after="40"/>
+            </w:pPr>
+            <w:r>
+              <w:rPr>
+                <w:b/>
+                <w:sz w:val="18"/>
+              </w:rPr>
+              <w:t>使用场景</w:t>
+            </w:r>
+          </w:p>
+        </w:tc>
+        <w:tc>
+          <w:tcPr>
+            <w:tcW w:type="dxa" w:w="6520"/>
+            <w:vAlign w:val="center"/>
+            <w:tcBorders>
+              <w:top w:val="single" w:sz="4" w:color="D9D9D9"/>
+              <w:left w:val="single" w:sz="4" w:color="D9D9D9"/>
+              <w:bottom w:val="single" w:sz="4" w:color="D9D9D9"/>
+              <w:right w:val="single" w:sz="4" w:color="D9D9D9"/>
+            </w:tcBorders>
+            <w:tcMar>
+              <w:top w:w="85" w:type="dxa"/>
+              <w:left w:w="85" w:type="dxa"/>
+              <w:bottom w:w="85" w:type="dxa"/>
+              <w:right w:w="85" w:type="dxa"/>
+            </w:tcMar>
+            <w:shd w:fill="E8EEF4"/>
+          </w:tcPr>
+          <w:p>
+            <w:pPr>
+              <w:spacing w:before="40" w:after="40"/>
+            </w:pPr>
+            <w:r>
+              <w:rPr>
+                <w:b/>
+                <w:sz w:val="18"/>
+              </w:rPr>
+              <w:t>文件和输出</w:t>
+            </w:r>
+          </w:p>
+        </w:tc>
+      </w:tr>
+      <w:tr>
+        <w:tc>
+          <w:tcPr>
+            <w:tcW w:type="dxa" w:w="3118"/>
+            <w:vAlign w:val="center"/>
+            <w:tcBorders>
+              <w:top w:val="single" w:sz="4" w:color="D9D9D9"/>
+              <w:left w:val="single" w:sz="4" w:color="D9D9D9"/>
+              <w:bottom w:val="single" w:sz="4" w:color="D9D9D9"/>
+              <w:right w:val="single" w:sz="4" w:color="D9D9D9"/>
+            </w:tcBorders>
+            <w:tcMar>
+              <w:top w:w="85" w:type="dxa"/>
+              <w:left w:w="85" w:type="dxa"/>
+              <w:bottom w:w="85" w:type="dxa"/>
+              <w:right w:w="85" w:type="dxa"/>
+            </w:tcMar>
+          </w:tcPr>
+          <w:p>
+            <w:pPr>
+              <w:spacing w:before="40" w:after="40"/>
+            </w:pPr>
+            <w:r>
+              <w:rPr>
+                <w:b w:val="0"/>
+                <w:sz w:val="18"/>
+              </w:rPr>
+              <w:t>直接执行式代码节点</w:t>
+            </w:r>
+          </w:p>
+        </w:tc>
+        <w:tc>
+          <w:tcPr>
+            <w:tcW w:type="dxa" w:w="6520"/>
+            <w:vAlign w:val="center"/>
+            <w:tcBorders>
+              <w:top w:val="single" w:sz="4" w:color="D9D9D9"/>
+              <w:left w:val="single" w:sz="4" w:color="D9D9D9"/>
+              <w:bottom w:val="single" w:sz="4" w:color="D9D9D9"/>
+              <w:right w:val="single" w:sz="4" w:color="D9D9D9"/>
+            </w:tcBorders>
+            <w:tcMar>
+              <w:top w:w="85" w:type="dxa"/>
+              <w:left w:w="85" w:type="dxa"/>
+              <w:bottom w:w="85" w:type="dxa"/>
+              <w:right w:w="85" w:type="dxa"/>
+            </w:tcMar>
+          </w:tcPr>
+          <w:p>
+            <w:pPr>
+              <w:spacing w:before="40" w:after="40"/>
+            </w:pPr>
+            <w:r>
+              <w:rPr>
+                <w:b w:val="0"/>
+                <w:sz w:val="18"/>
+              </w:rPr>
+              <w:t>dingtalk_node.py</w:t>
+              <w:br/>
+              <w:t>输入 iPaas_result，生成变量 result</w:t>
+            </w:r>
+          </w:p>
+        </w:tc>
+      </w:tr>
+      <w:tr>
+        <w:tc>
+          <w:tcPr>
+            <w:tcW w:type="dxa" w:w="3118"/>
+            <w:vAlign w:val="center"/>
+            <w:tcBorders>
+              <w:top w:val="single" w:sz="4" w:color="D9D9D9"/>
+              <w:left w:val="single" w:sz="4" w:color="D9D9D9"/>
+              <w:bottom w:val="single" w:sz="4" w:color="D9D9D9"/>
+              <w:right w:val="single" w:sz="4" w:color="D9D9D9"/>
+            </w:tcBorders>
+            <w:tcMar>
+              <w:top w:w="85" w:type="dxa"/>
+              <w:left w:w="85" w:type="dxa"/>
+              <w:bottom w:w="85" w:type="dxa"/>
+              <w:right w:w="85" w:type="dxa"/>
+            </w:tcMar>
+          </w:tcPr>
+          <w:p>
+            <w:pPr>
+              <w:spacing w:before="40" w:after="40"/>
+            </w:pPr>
+            <w:r>
+              <w:rPr>
+                <w:b w:val="0"/>
+                <w:sz w:val="18"/>
+              </w:rPr>
+              <w:t>函数式代码节点</w:t>
+            </w:r>
+          </w:p>
+        </w:tc>
+        <w:tc>
+          <w:tcPr>
+            <w:tcW w:type="dxa" w:w="6520"/>
+            <w:vAlign w:val="center"/>
+            <w:tcBorders>
+              <w:top w:val="single" w:sz="4" w:color="D9D9D9"/>
+              <w:left w:val="single" w:sz="4" w:color="D9D9D9"/>
+              <w:bottom w:val="single" w:sz="4" w:color="D9D9D9"/>
+              <w:right w:val="single" w:sz="4" w:color="D9D9D9"/>
+            </w:tcBorders>
+            <w:tcMar>
+              <w:top w:w="85" w:type="dxa"/>
+              <w:left w:w="85" w:type="dxa"/>
+              <w:bottom w:w="85" w:type="dxa"/>
+              <w:right w:w="85" w:type="dxa"/>
+            </w:tcMar>
+          </w:tcPr>
+          <w:p>
+            <w:pPr>
+              <w:spacing w:before="40" w:after="40"/>
+            </w:pPr>
+            <w:r>
+              <w:rPr>
+                <w:b w:val="0"/>
+                <w:sz w:val="18"/>
+              </w:rPr>
+              <w:t>dingtalk_transform.py</w:t>
+              <w:br/>
+              <w:t>main(iPaas_result) 返回含 result 的对象</w:t>
+            </w:r>
+          </w:p>
+        </w:tc>
+      </w:tr>
+      <w:tr>
+        <w:tc>
+          <w:tcPr>
+            <w:tcW w:type="dxa" w:w="3118"/>
+            <w:vAlign w:val="center"/>
+            <w:tcBorders>
+              <w:top w:val="single" w:sz="4" w:color="D9D9D9"/>
+              <w:left w:val="single" w:sz="4" w:color="D9D9D9"/>
+              <w:bottom w:val="single" w:sz="4" w:color="D9D9D9"/>
+              <w:right w:val="single" w:sz="4" w:color="D9D9D9"/>
+            </w:tcBorders>
+            <w:tcMar>
+              <w:top w:w="85" w:type="dxa"/>
+              <w:left w:w="85" w:type="dxa"/>
+              <w:bottom w:w="85" w:type="dxa"/>
+              <w:right w:w="85" w:type="dxa"/>
+            </w:tcMar>
+          </w:tcPr>
+          <w:p>
+            <w:pPr>
+              <w:spacing w:before="40" w:after="40"/>
+            </w:pPr>
+            <w:r>
+              <w:rPr>
+                <w:b w:val="0"/>
+                <w:sz w:val="18"/>
+              </w:rPr>
+              <w:t>本地程序调用</w:t>
+            </w:r>
+          </w:p>
+        </w:tc>
+        <w:tc>
+          <w:tcPr>
+            <w:tcW w:type="dxa" w:w="6520"/>
+            <w:vAlign w:val="center"/>
+            <w:tcBorders>
+              <w:top w:val="single" w:sz="4" w:color="D9D9D9"/>
+              <w:left w:val="single" w:sz="4" w:color="D9D9D9"/>
+              <w:bottom w:val="single" w:sz="4" w:color="D9D9D9"/>
+              <w:right w:val="single" w:sz="4" w:color="D9D9D9"/>
+            </w:tcBorders>
+            <w:tcMar>
+              <w:top w:w="85" w:type="dxa"/>
+              <w:left w:w="85" w:type="dxa"/>
+              <w:bottom w:w="85" w:type="dxa"/>
+              <w:right w:w="85" w:type="dxa"/>
+            </w:tcMar>
+          </w:tcPr>
+          <w:p>
+            <w:pPr>
+              <w:spacing w:before="40" w:after="40"/>
+            </w:pPr>
+            <w:r>
+              <w:rPr>
+                <w:b w:val="0"/>
+                <w:sz w:val="18"/>
+              </w:rPr>
+              <w:t>transform_records(records) 返回列表</w:t>
+              <w:br/>
+              <w:t>transform(records) 为兼容入口</w:t>
+            </w:r>
+          </w:p>
+        </w:tc>
+      </w:tr>
+    </w:tbl>
+    <w:p>
+      <w:pPr>
+        <w:spacing w:after="0"/>
+      </w:pPr>
+    </w:p>
+    <w:p>
+      <w:pPr>
+        <w:pStyle w:val="Heading1"/>
+      </w:pPr>
+      <w:r>
+        <w:t>2 绑定输入并取得结果</w:t>
+      </w:r>
+    </w:p>
+    <w:p>
+      <w:r>
+        <w:t>① 在代码节点中添加输入参数 iPaas_result，绑定“获取多行记录”的原始列表。上一步结果的名称不会自动成为当前代码节点的输入。</w:t>
+      </w:r>
+    </w:p>
+    <w:p>
+      <w:r>
+        <w:t>② 直接执行式节点粘贴 dingtalk_node.py 全文，配置 result 为列表或通用 JSON 输出。函数式节点使用另一个文件，并按平台要求适配函数名及参数签名。</w:t>
+      </w:r>
+    </w:p>
+    <w:p>
+      <w:pPr>
+        <w:spacing w:line="252" w:lineRule="auto"/>
+        <w:ind w:left="113"/>
+      </w:pPr>
+      <w:r>
+        <w:rPr>
+          <w:rFonts w:ascii="Consolas" w:hAnsi="Consolas" w:eastAsia="Microsoft YaHei"/>
+          <w:sz w:val="18"/>
+        </w:rPr>
+        <w:t># 直接执行式文件末尾已有此行</w:t>
+        <w:br/>
+        <w:t>result = transform_records(iPaas_result)</w:t>
+      </w:r>
+    </w:p>
+    <w:p>
+      <w:r>
+        <w:t>③ 下游读取 result[i]["店铺"] 和 result[i]["站点"]。unionId[i] 与 name[i] 按下标表示同一个负责人。不要再通过动态店铺键读取列表。</w:t>
+      </w:r>
+    </w:p>
+    <w:p>
+      <w:r>
+        <w:t>转换代码不导入模块，不打印数据，不发网络请求，不读写文件，不修改输入。运行中的密码字符原样保留；只有仓库示例采用虚构凭据。</w:t>
+      </w:r>
+    </w:p>
+    <w:p>
+      <w:r>
+        <w:br w:type="page"/>
+      </w:r>
+    </w:p>
+    <w:p>
+      <w:pPr>
+        <w:pStyle w:val="Heading1"/>
+      </w:pPr>
+      <w:r>
+        <w:t>3 输入输出字段</w:t>
+      </w:r>
+    </w:p>
+    <w:tbl>
+      <w:tblPr>
+        <w:tblW w:type="auto" w:w="0"/>
+        <w:tblLayout w:type="fixed"/>
+        <w:tblLook w:firstColumn="1" w:firstRow="1" w:lastColumn="0" w:lastRow="0" w:noHBand="0" w:noVBand="1" w:val="04A0"/>
+      </w:tblPr>
+      <w:tblGrid>
+        <w:gridCol w:w="4535"/>
+        <w:gridCol w:w="5102"/>
+      </w:tblGrid>
+      <w:tr>
+        <w:trPr>
+          <w:tblHeader/>
+        </w:trPr>
+        <w:tc>
+          <w:tcPr>
+            <w:tcW w:type="dxa" w:w="4535"/>
+            <w:vAlign w:val="center"/>
+            <w:tcBorders>
+              <w:top w:val="single" w:sz="4" w:color="D9D9D9"/>
+              <w:left w:val="single" w:sz="4" w:color="D9D9D9"/>
+              <w:bottom w:val="single" w:sz="4" w:color="D9D9D9"/>
+              <w:right w:val="single" w:sz="4" w:color="D9D9D9"/>
+            </w:tcBorders>
+            <w:tcMar>
+              <w:top w:w="85" w:type="dxa"/>
+              <w:left w:w="85" w:type="dxa"/>
+              <w:bottom w:w="85" w:type="dxa"/>
+              <w:right w:w="85" w:type="dxa"/>
+            </w:tcMar>
+            <w:shd w:fill="E8EEF4"/>
+          </w:tcPr>
+          <w:p>
+            <w:pPr>
+              <w:spacing w:before="40" w:after="40"/>
+            </w:pPr>
+            <w:r>
+              <w:rPr>
+                <w:b/>
+                <w:sz w:val="18"/>
+              </w:rPr>
+              <w:t>原始 fields 字段</w:t>
+            </w:r>
+          </w:p>
+        </w:tc>
+        <w:tc>
+          <w:tcPr>
+            <w:tcW w:type="dxa" w:w="5102"/>
+            <w:vAlign w:val="center"/>
+            <w:tcBorders>
+              <w:top w:val="single" w:sz="4" w:color="D9D9D9"/>
+              <w:left w:val="single" w:sz="4" w:color="D9D9D9"/>
+              <w:bottom w:val="single" w:sz="4" w:color="D9D9D9"/>
+              <w:right w:val="single" w:sz="4" w:color="D9D9D9"/>
+            </w:tcBorders>
+            <w:tcMar>
+              <w:top w:w="85" w:type="dxa"/>
+              <w:left w:w="85" w:type="dxa"/>
+              <w:bottom w:w="85" w:type="dxa"/>
+              <w:right w:w="85" w:type="dxa"/>
+            </w:tcMar>
+            <w:shd w:fill="E8EEF4"/>
+          </w:tcPr>
+          <w:p>
+            <w:pPr>
+              <w:spacing w:before="40" w:after="40"/>
+            </w:pPr>
+            <w:r>
+              <w:rPr>
+                <w:b/>
+                <w:sz w:val="18"/>
+              </w:rPr>
+              <w:t>输出字段和类型</w:t>
+            </w:r>
+          </w:p>
+        </w:tc>
+      </w:tr>
+      <w:tr>
+        <w:tc>
+          <w:tcPr>
+            <w:tcW w:type="dxa" w:w="4535"/>
+            <w:vAlign w:val="center"/>
+            <w:tcBorders>
+              <w:top w:val="single" w:sz="4" w:color="D9D9D9"/>
+              <w:left w:val="single" w:sz="4" w:color="D9D9D9"/>
+              <w:bottom w:val="single" w:sz="4" w:color="D9D9D9"/>
+              <w:right w:val="single" w:sz="4" w:color="D9D9D9"/>
+            </w:tcBorders>
+            <w:tcMar>
+              <w:top w:w="85" w:type="dxa"/>
+              <w:left w:w="85" w:type="dxa"/>
+              <w:bottom w:w="85" w:type="dxa"/>
+              <w:right w:w="85" w:type="dxa"/>
+            </w:tcMar>
+          </w:tcPr>
+          <w:p>
+            <w:pPr>
+              <w:spacing w:before="40" w:after="40"/>
+            </w:pPr>
+            <w:r>
+              <w:rPr>
+                <w:b w:val="0"/>
+                <w:sz w:val="18"/>
+              </w:rPr>
+              <w:t>公司名</w:t>
+            </w:r>
+          </w:p>
+        </w:tc>
+        <w:tc>
+          <w:tcPr>
+            <w:tcW w:type="dxa" w:w="5102"/>
+            <w:vAlign w:val="center"/>
+            <w:tcBorders>
+              <w:top w:val="single" w:sz="4" w:color="D9D9D9"/>
+              <w:left w:val="single" w:sz="4" w:color="D9D9D9"/>
+              <w:bottom w:val="single" w:sz="4" w:color="D9D9D9"/>
+              <w:right w:val="single" w:sz="4" w:color="D9D9D9"/>
+            </w:tcBorders>
+            <w:tcMar>
+              <w:top w:w="85" w:type="dxa"/>
+              <w:left w:w="85" w:type="dxa"/>
+              <w:bottom w:w="85" w:type="dxa"/>
+              <w:right w:w="85" w:type="dxa"/>
+            </w:tcMar>
+          </w:tcPr>
+          <w:p>
+            <w:pPr>
+              <w:spacing w:before="40" w:after="40"/>
+            </w:pPr>
+            <w:r>
+              <w:rPr>
+                <w:b w:val="0"/>
+                <w:sz w:val="18"/>
+              </w:rPr>
+              <w:t>公司名  字符串</w:t>
+            </w:r>
+          </w:p>
+        </w:tc>
+      </w:tr>
+      <w:tr>
+        <w:tc>
+          <w:tcPr>
+            <w:tcW w:type="dxa" w:w="4535"/>
+            <w:vAlign w:val="center"/>
+            <w:tcBorders>
+              <w:top w:val="single" w:sz="4" w:color="D9D9D9"/>
+              <w:left w:val="single" w:sz="4" w:color="D9D9D9"/>
+              <w:bottom w:val="single" w:sz="4" w:color="D9D9D9"/>
+              <w:right w:val="single" w:sz="4" w:color="D9D9D9"/>
+            </w:tcBorders>
+            <w:tcMar>
+              <w:top w:w="85" w:type="dxa"/>
+              <w:left w:w="85" w:type="dxa"/>
+              <w:bottom w:w="85" w:type="dxa"/>
+              <w:right w:w="85" w:type="dxa"/>
+            </w:tcMar>
+          </w:tcPr>
+          <w:p>
+            <w:pPr>
+              <w:spacing w:before="40" w:after="40"/>
+            </w:pPr>
+            <w:r>
+              <w:rPr>
+                <w:b w:val="0"/>
+                <w:sz w:val="18"/>
+              </w:rPr>
+              <w:t>企业用户名</w:t>
+            </w:r>
+          </w:p>
+        </w:tc>
+        <w:tc>
+          <w:tcPr>
+            <w:tcW w:type="dxa" w:w="5102"/>
+            <w:vAlign w:val="center"/>
+            <w:tcBorders>
+              <w:top w:val="single" w:sz="4" w:color="D9D9D9"/>
+              <w:left w:val="single" w:sz="4" w:color="D9D9D9"/>
+              <w:bottom w:val="single" w:sz="4" w:color="D9D9D9"/>
+              <w:right w:val="single" w:sz="4" w:color="D9D9D9"/>
+            </w:tcBorders>
+            <w:tcMar>
+              <w:top w:w="85" w:type="dxa"/>
+              <w:left w:w="85" w:type="dxa"/>
+              <w:bottom w:w="85" w:type="dxa"/>
+              <w:right w:w="85" w:type="dxa"/>
+            </w:tcMar>
+          </w:tcPr>
+          <w:p>
+            <w:pPr>
+              <w:spacing w:before="40" w:after="40"/>
+            </w:pPr>
+            <w:r>
+              <w:rPr>
+                <w:b w:val="0"/>
+                <w:sz w:val="18"/>
+              </w:rPr>
+              <w:t>企业用户名  字符串</w:t>
+            </w:r>
+          </w:p>
+        </w:tc>
+      </w:tr>
+      <w:tr>
+        <w:tc>
+          <w:tcPr>
+            <w:tcW w:type="dxa" w:w="4535"/>
+            <w:vAlign w:val="center"/>
+            <w:tcBorders>
+              <w:top w:val="single" w:sz="4" w:color="D9D9D9"/>
+              <w:left w:val="single" w:sz="4" w:color="D9D9D9"/>
+              <w:bottom w:val="single" w:sz="4" w:color="D9D9D9"/>
+              <w:right w:val="single" w:sz="4" w:color="D9D9D9"/>
+            </w:tcBorders>
+            <w:tcMar>
+              <w:top w:w="85" w:type="dxa"/>
+              <w:left w:w="85" w:type="dxa"/>
+              <w:bottom w:w="85" w:type="dxa"/>
+              <w:right w:w="85" w:type="dxa"/>
+            </w:tcMar>
+          </w:tcPr>
+          <w:p>
+            <w:pPr>
+              <w:spacing w:before="40" w:after="40"/>
+            </w:pPr>
+            <w:r>
+              <w:rPr>
+                <w:b w:val="0"/>
+                <w:sz w:val="18"/>
+              </w:rPr>
+              <w:t>企业密码</w:t>
+            </w:r>
+          </w:p>
+        </w:tc>
+        <w:tc>
+          <w:tcPr>
+            <w:tcW w:type="dxa" w:w="5102"/>
+            <w:vAlign w:val="center"/>
+            <w:tcBorders>
+              <w:top w:val="single" w:sz="4" w:color="D9D9D9"/>
+              <w:left w:val="single" w:sz="4" w:color="D9D9D9"/>
+              <w:bottom w:val="single" w:sz="4" w:color="D9D9D9"/>
+              <w:right w:val="single" w:sz="4" w:color="D9D9D9"/>
+            </w:tcBorders>
+            <w:tcMar>
+              <w:top w:w="85" w:type="dxa"/>
+              <w:left w:w="85" w:type="dxa"/>
+              <w:bottom w:w="85" w:type="dxa"/>
+              <w:right w:w="85" w:type="dxa"/>
+            </w:tcMar>
+          </w:tcPr>
+          <w:p>
+            <w:pPr>
+              <w:spacing w:before="40" w:after="40"/>
+            </w:pPr>
+            <w:r>
+              <w:rPr>
+                <w:b w:val="0"/>
+                <w:sz w:val="18"/>
+              </w:rPr>
+              <w:t>企业密码  字符串</w:t>
+            </w:r>
+          </w:p>
+        </w:tc>
+      </w:tr>
+      <w:tr>
+        <w:tc>
+          <w:tcPr>
+            <w:tcW w:type="dxa" w:w="4535"/>
+            <w:vAlign w:val="center"/>
+            <w:tcBorders>
+              <w:top w:val="single" w:sz="4" w:color="D9D9D9"/>
+              <w:left w:val="single" w:sz="4" w:color="D9D9D9"/>
+              <w:bottom w:val="single" w:sz="4" w:color="D9D9D9"/>
+              <w:right w:val="single" w:sz="4" w:color="D9D9D9"/>
+            </w:tcBorders>
+            <w:tcMar>
+              <w:top w:w="85" w:type="dxa"/>
+              <w:left w:w="85" w:type="dxa"/>
+              <w:bottom w:w="85" w:type="dxa"/>
+              <w:right w:w="85" w:type="dxa"/>
+            </w:tcMar>
+          </w:tcPr>
+          <w:p>
+            <w:pPr>
+              <w:spacing w:before="40" w:after="40"/>
+            </w:pPr>
+            <w:r>
+              <w:rPr>
+                <w:b w:val="0"/>
+                <w:sz w:val="18"/>
+              </w:rPr>
+              <w:t>店铺</w:t>
+            </w:r>
+          </w:p>
+        </w:tc>
+        <w:tc>
+          <w:tcPr>
+            <w:tcW w:type="dxa" w:w="5102"/>
+            <w:vAlign w:val="center"/>
+            <w:tcBorders>
+              <w:top w:val="single" w:sz="4" w:color="D9D9D9"/>
+              <w:left w:val="single" w:sz="4" w:color="D9D9D9"/>
+              <w:bottom w:val="single" w:sz="4" w:color="D9D9D9"/>
+              <w:right w:val="single" w:sz="4" w:color="D9D9D9"/>
+            </w:tcBorders>
+            <w:tcMar>
+              <w:top w:w="85" w:type="dxa"/>
+              <w:left w:w="85" w:type="dxa"/>
+              <w:bottom w:w="85" w:type="dxa"/>
+              <w:right w:w="85" w:type="dxa"/>
+            </w:tcMar>
+          </w:tcPr>
+          <w:p>
+            <w:pPr>
+              <w:spacing w:before="40" w:after="40"/>
+            </w:pPr>
+            <w:r>
+              <w:rPr>
+                <w:b w:val="0"/>
+                <w:sz w:val="18"/>
+              </w:rPr>
+              <w:t>店铺  字符串</w:t>
+            </w:r>
+          </w:p>
+        </w:tc>
+      </w:tr>
+      <w:tr>
+        <w:tc>
+          <w:tcPr>
+            <w:tcW w:type="dxa" w:w="4535"/>
+            <w:vAlign w:val="center"/>
+            <w:tcBorders>
+              <w:top w:val="single" w:sz="4" w:color="D9D9D9"/>
+              <w:left w:val="single" w:sz="4" w:color="D9D9D9"/>
+              <w:bottom w:val="single" w:sz="4" w:color="D9D9D9"/>
+              <w:right w:val="single" w:sz="4" w:color="D9D9D9"/>
+            </w:tcBorders>
+            <w:tcMar>
+              <w:top w:w="85" w:type="dxa"/>
+              <w:left w:w="85" w:type="dxa"/>
+              <w:bottom w:w="85" w:type="dxa"/>
+              <w:right w:w="85" w:type="dxa"/>
+            </w:tcMar>
+          </w:tcPr>
+          <w:p>
+            <w:pPr>
+              <w:spacing w:before="40" w:after="40"/>
+            </w:pPr>
+            <w:r>
+              <w:rPr>
+                <w:b w:val="0"/>
+                <w:sz w:val="18"/>
+              </w:rPr>
+              <w:t>站点[*].name</w:t>
+            </w:r>
+          </w:p>
+        </w:tc>
+        <w:tc>
+          <w:tcPr>
+            <w:tcW w:type="dxa" w:w="5102"/>
+            <w:vAlign w:val="center"/>
+            <w:tcBorders>
+              <w:top w:val="single" w:sz="4" w:color="D9D9D9"/>
+              <w:left w:val="single" w:sz="4" w:color="D9D9D9"/>
+              <w:bottom w:val="single" w:sz="4" w:color="D9D9D9"/>
+              <w:right w:val="single" w:sz="4" w:color="D9D9D9"/>
+            </w:tcBorders>
+            <w:tcMar>
+              <w:top w:w="85" w:type="dxa"/>
+              <w:left w:w="85" w:type="dxa"/>
+              <w:bottom w:w="85" w:type="dxa"/>
+              <w:right w:w="85" w:type="dxa"/>
+            </w:tcMar>
+          </w:tcPr>
+          <w:p>
+            <w:pPr>
+              <w:spacing w:before="40" w:after="40"/>
+            </w:pPr>
+            <w:r>
+              <w:rPr>
+                <w:b w:val="0"/>
+                <w:sz w:val="18"/>
+              </w:rPr>
+              <w:t>站点  字符串列表</w:t>
+            </w:r>
+          </w:p>
+        </w:tc>
+      </w:tr>
+      <w:tr>
+        <w:tc>
+          <w:tcPr>
+            <w:tcW w:type="dxa" w:w="4535"/>
+            <w:vAlign w:val="center"/>
+            <w:tcBorders>
+              <w:top w:val="single" w:sz="4" w:color="D9D9D9"/>
+              <w:left w:val="single" w:sz="4" w:color="D9D9D9"/>
+              <w:bottom w:val="single" w:sz="4" w:color="D9D9D9"/>
+              <w:right w:val="single" w:sz="4" w:color="D9D9D9"/>
+            </w:tcBorders>
+            <w:tcMar>
+              <w:top w:w="85" w:type="dxa"/>
+              <w:left w:w="85" w:type="dxa"/>
+              <w:bottom w:w="85" w:type="dxa"/>
+              <w:right w:w="85" w:type="dxa"/>
+            </w:tcMar>
+          </w:tcPr>
+          <w:p>
+            <w:pPr>
+              <w:spacing w:before="40" w:after="40"/>
+            </w:pPr>
+            <w:r>
+              <w:rPr>
+                <w:b w:val="0"/>
+                <w:sz w:val="18"/>
+              </w:rPr>
+              <w:t>运营负责人[*].unionId</w:t>
+            </w:r>
+          </w:p>
+        </w:tc>
+        <w:tc>
+          <w:tcPr>
+            <w:tcW w:type="dxa" w:w="5102"/>
+            <w:vAlign w:val="center"/>
+            <w:tcBorders>
+              <w:top w:val="single" w:sz="4" w:color="D9D9D9"/>
+              <w:left w:val="single" w:sz="4" w:color="D9D9D9"/>
+              <w:bottom w:val="single" w:sz="4" w:color="D9D9D9"/>
+              <w:right w:val="single" w:sz="4" w:color="D9D9D9"/>
+            </w:tcBorders>
+            <w:tcMar>
+              <w:top w:w="85" w:type="dxa"/>
+              <w:left w:w="85" w:type="dxa"/>
+              <w:bottom w:w="85" w:type="dxa"/>
+              <w:right w:w="85" w:type="dxa"/>
+            </w:tcMar>
+          </w:tcPr>
+          <w:p>
+            <w:pPr>
+              <w:spacing w:before="40" w:after="40"/>
+            </w:pPr>
+            <w:r>
+              <w:rPr>
+                <w:b w:val="0"/>
+                <w:sz w:val="18"/>
+              </w:rPr>
+              <w:t>unionId  字符串列表</w:t>
+            </w:r>
+          </w:p>
+        </w:tc>
+      </w:tr>
+      <w:tr>
+        <w:tc>
+          <w:tcPr>
+            <w:tcW w:type="dxa" w:w="4535"/>
+            <w:vAlign w:val="center"/>
+            <w:tcBorders>
+              <w:top w:val="single" w:sz="4" w:color="D9D9D9"/>
+              <w:left w:val="single" w:sz="4" w:color="D9D9D9"/>
+              <w:bottom w:val="single" w:sz="4" w:color="D9D9D9"/>
+              <w:right w:val="single" w:sz="4" w:color="D9D9D9"/>
+            </w:tcBorders>
+            <w:tcMar>
+              <w:top w:w="85" w:type="dxa"/>
+              <w:left w:w="85" w:type="dxa"/>
+              <w:bottom w:w="85" w:type="dxa"/>
+              <w:right w:w="85" w:type="dxa"/>
+            </w:tcMar>
+          </w:tcPr>
+          <w:p>
+            <w:pPr>
+              <w:spacing w:before="40" w:after="40"/>
+            </w:pPr>
+            <w:r>
+              <w:rPr>
+                <w:b w:val="0"/>
+                <w:sz w:val="18"/>
+              </w:rPr>
+              <w:t>运营负责人[*].name</w:t>
+            </w:r>
+          </w:p>
+        </w:tc>
+        <w:tc>
+          <w:tcPr>
+            <w:tcW w:type="dxa" w:w="5102"/>
+            <w:vAlign w:val="center"/>
+            <w:tcBorders>
+              <w:top w:val="single" w:sz="4" w:color="D9D9D9"/>
+              <w:left w:val="single" w:sz="4" w:color="D9D9D9"/>
+              <w:bottom w:val="single" w:sz="4" w:color="D9D9D9"/>
+              <w:right w:val="single" w:sz="4" w:color="D9D9D9"/>
+            </w:tcBorders>
+            <w:tcMar>
+              <w:top w:w="85" w:type="dxa"/>
+              <w:left w:w="85" w:type="dxa"/>
+              <w:bottom w:w="85" w:type="dxa"/>
+              <w:right w:w="85" w:type="dxa"/>
+            </w:tcMar>
+          </w:tcPr>
+          <w:p>
+            <w:pPr>
+              <w:spacing w:before="40" w:after="40"/>
+            </w:pPr>
+            <w:r>
+              <w:rPr>
+                <w:b w:val="0"/>
+                <w:sz w:val="18"/>
+              </w:rPr>
+              <w:t>name  字符串列表</w:t>
+            </w:r>
+          </w:p>
+        </w:tc>
+      </w:tr>
+    </w:tbl>
+    <w:p>
+      <w:pPr>
+        <w:spacing w:after="0"/>
+      </w:pPr>
+    </w:p>
+    <w:p>
+      <w:r>
+        <w:t>输出示例使用虚构公司、账号、密码与人员标识。创建人、修改人、时间戳、记录 id 及站点 id 不进入输出。</w:t>
+      </w:r>
+    </w:p>
+    <w:p>
+      <w:pPr>
+        <w:spacing w:line="252" w:lineRule="auto"/>
+        <w:ind w:left="113"/>
+      </w:pPr>
+      <w:r>
+        <w:rPr>
+          <w:rFonts w:ascii="Consolas" w:hAnsi="Consolas" w:eastAsia="Microsoft YaHei"/>
+          <w:sz w:val="18"/>
+        </w:rPr>
+        <w:t>[</w:t>
+        <w:br/>
+        <w:t xml:space="preserve">  {</w:t>
+        <w:br/>
+        <w:t xml:space="preserve">    "公司名": "示例医疗公司",</w:t>
+        <w:br/>
+        <w:t xml:space="preserve">    "企业用户名": "demo_medical",</w:t>
+        <w:br/>
+        <w:t xml:space="preserve">    "企业密码": "DemoOnly}|#2026",</w:t>
+        <w:br/>
+        <w:t xml:space="preserve">    "店铺": "示例医疗店",</w:t>
+        <w:br/>
+        <w:t xml:space="preserve">    "站点": ["美国", "加拿大", "墨西哥"],</w:t>
+        <w:br/>
+        <w:t xml:space="preserve">    "unionId": ["demo_u01"],</w:t>
+        <w:br/>
+        <w:t xml:space="preserve">    "name": ["负责人甲"]</w:t>
+        <w:br/>
+        <w:t xml:space="preserve">  }</w:t>
+        <w:br/>
+        <w:t>]</w:t>
+      </w:r>
+    </w:p>
+    <w:p>
+      <w:r>
+        <w:t>完整输入输出见 examples/input.json 和 examples/output.json。main 返回外层含 result 的对象，见 examples/main_output.json。JSON Schema 位于 schemas 目录。</w:t>
+      </w:r>
+    </w:p>
+    <w:p>
+      <w:r>
+        <w:t>仓库示例共 10 条输入，含 1 条重复有效记录和 2 条空记录，输出 8 条。重复项在输出中保留。用户提供的数据含 7 条有效记录，转换后为 7 条。</w:t>
+      </w:r>
+    </w:p>
+    <w:p>
+      <w:r>
+        <w:br w:type="page"/>
+      </w:r>
+    </w:p>
+    <w:p>
+      <w:pPr>
+        <w:pStyle w:val="Heading1"/>
+      </w:pPr>
+      <w:r>
+        <w:t>4 缺失值与校验规则</w:t>
+      </w:r>
+    </w:p>
+    <w:tbl>
+      <w:tblPr>
+        <w:tblW w:type="auto" w:w="0"/>
+        <w:tblLayout w:type="fixed"/>
+        <w:tblLook w:firstColumn="1" w:firstRow="1" w:lastColumn="0" w:lastRow="0" w:noHBand="0" w:noVBand="1" w:val="04A0"/>
+      </w:tblPr>
+      <w:tblGrid>
+        <w:gridCol w:w="2154"/>
+        <w:gridCol w:w="7483"/>
+      </w:tblGrid>
+      <w:tr>
+        <w:trPr>
+          <w:tblHeader/>
+        </w:trPr>
+        <w:tc>
+          <w:tcPr>
+            <w:tcW w:type="dxa" w:w="2154"/>
+            <w:vAlign w:val="center"/>
+            <w:tcBorders>
+              <w:top w:val="single" w:sz="4" w:color="D9D9D9"/>
+              <w:left w:val="single" w:sz="4" w:color="D9D9D9"/>
+              <w:bottom w:val="single" w:sz="4" w:color="D9D9D9"/>
+              <w:right w:val="single" w:sz="4" w:color="D9D9D9"/>
+            </w:tcBorders>
+            <w:tcMar>
+              <w:top w:w="85" w:type="dxa"/>
+              <w:left w:w="85" w:type="dxa"/>
+              <w:bottom w:w="85" w:type="dxa"/>
+              <w:right w:w="85" w:type="dxa"/>
+            </w:tcMar>
+            <w:shd w:fill="E8EEF4"/>
+          </w:tcPr>
+          <w:p>
+            <w:pPr>
+              <w:spacing w:before="40" w:after="40"/>
+            </w:pPr>
+            <w:r>
+              <w:rPr>
+                <w:b/>
+                <w:sz w:val="18"/>
+              </w:rPr>
+              <w:t>项目</w:t>
+            </w:r>
+          </w:p>
+        </w:tc>
+        <w:tc>
+          <w:tcPr>
+            <w:tcW w:type="dxa" w:w="7483"/>
+            <w:vAlign w:val="center"/>
+            <w:tcBorders>
+              <w:top w:val="single" w:sz="4" w:color="D9D9D9"/>
+              <w:left w:val="single" w:sz="4" w:color="D9D9D9"/>
+              <w:bottom w:val="single" w:sz="4" w:color="D9D9D9"/>
+              <w:right w:val="single" w:sz="4" w:color="D9D9D9"/>
+            </w:tcBorders>
+            <w:tcMar>
+              <w:top w:w="85" w:type="dxa"/>
+              <w:left w:w="85" w:type="dxa"/>
+              <w:bottom w:w="85" w:type="dxa"/>
+              <w:right w:w="85" w:type="dxa"/>
+            </w:tcMar>
+            <w:shd w:fill="E8EEF4"/>
+          </w:tcPr>
+          <w:p>
+            <w:pPr>
+              <w:spacing w:before="40" w:after="40"/>
+            </w:pPr>
+            <w:r>
+              <w:rPr>
+                <w:b/>
+                <w:sz w:val="18"/>
+              </w:rPr>
+              <w:t>处理方式</w:t>
+            </w:r>
+          </w:p>
+        </w:tc>
+      </w:tr>
+      <w:tr>
+        <w:tc>
+          <w:tcPr>
+            <w:tcW w:type="dxa" w:w="2154"/>
+            <w:vAlign w:val="center"/>
+            <w:tcBorders>
+              <w:top w:val="single" w:sz="4" w:color="D9D9D9"/>
+              <w:left w:val="single" w:sz="4" w:color="D9D9D9"/>
+              <w:bottom w:val="single" w:sz="4" w:color="D9D9D9"/>
+              <w:right w:val="single" w:sz="4" w:color="D9D9D9"/>
+            </w:tcBorders>
+            <w:tcMar>
+              <w:top w:w="85" w:type="dxa"/>
+              <w:left w:w="85" w:type="dxa"/>
+              <w:bottom w:w="85" w:type="dxa"/>
+              <w:right w:w="85" w:type="dxa"/>
+            </w:tcMar>
+          </w:tcPr>
+          <w:p>
+            <w:pPr>
+              <w:spacing w:before="40" w:after="40"/>
+            </w:pPr>
+            <w:r>
+              <w:rPr>
+                <w:b w:val="0"/>
+                <w:sz w:val="18"/>
+              </w:rPr>
+              <w:t>记录数量</w:t>
+            </w:r>
+          </w:p>
+        </w:tc>
+        <w:tc>
+          <w:tcPr>
+            <w:tcW w:type="dxa" w:w="7483"/>
+            <w:vAlign w:val="center"/>
+            <w:tcBorders>
+              <w:top w:val="single" w:sz="4" w:color="D9D9D9"/>
+              <w:left w:val="single" w:sz="4" w:color="D9D9D9"/>
+              <w:bottom w:val="single" w:sz="4" w:color="D9D9D9"/>
+              <w:right w:val="single" w:sz="4" w:color="D9D9D9"/>
+            </w:tcBorders>
+            <w:tcMar>
+              <w:top w:w="85" w:type="dxa"/>
+              <w:left w:w="85" w:type="dxa"/>
+              <w:bottom w:w="85" w:type="dxa"/>
+              <w:right w:w="85" w:type="dxa"/>
+            </w:tcMar>
+          </w:tcPr>
+          <w:p>
+            <w:pPr>
+              <w:spacing w:before="40" w:after="40"/>
+            </w:pPr>
+            <w:r>
+              <w:rPr>
+                <w:b w:val="0"/>
+                <w:sz w:val="18"/>
+              </w:rPr>
+              <w:t>每条非空 fields 记录对应一条输出；不分组、不合并、不去重。</w:t>
+            </w:r>
+          </w:p>
+        </w:tc>
+      </w:tr>
+      <w:tr>
+        <w:tc>
+          <w:tcPr>
+            <w:tcW w:type="dxa" w:w="2154"/>
+            <w:vAlign w:val="center"/>
+            <w:tcBorders>
+              <w:top w:val="single" w:sz="4" w:color="D9D9D9"/>
+              <w:left w:val="single" w:sz="4" w:color="D9D9D9"/>
+              <w:bottom w:val="single" w:sz="4" w:color="D9D9D9"/>
+              <w:right w:val="single" w:sz="4" w:color="D9D9D9"/>
+            </w:tcBorders>
+            <w:tcMar>
+              <w:top w:w="85" w:type="dxa"/>
+              <w:left w:w="85" w:type="dxa"/>
+              <w:bottom w:w="85" w:type="dxa"/>
+              <w:right w:w="85" w:type="dxa"/>
+            </w:tcMar>
+          </w:tcPr>
+          <w:p>
+            <w:pPr>
+              <w:spacing w:before="40" w:after="40"/>
+            </w:pPr>
+            <w:r>
+              <w:rPr>
+                <w:b w:val="0"/>
+                <w:sz w:val="18"/>
+              </w:rPr>
+              <w:t>空记录</w:t>
+            </w:r>
+          </w:p>
+        </w:tc>
+        <w:tc>
+          <w:tcPr>
+            <w:tcW w:type="dxa" w:w="7483"/>
+            <w:vAlign w:val="center"/>
+            <w:tcBorders>
+              <w:top w:val="single" w:sz="4" w:color="D9D9D9"/>
+              <w:left w:val="single" w:sz="4" w:color="D9D9D9"/>
+              <w:bottom w:val="single" w:sz="4" w:color="D9D9D9"/>
+              <w:right w:val="single" w:sz="4" w:color="D9D9D9"/>
+            </w:tcBorders>
+            <w:tcMar>
+              <w:top w:w="85" w:type="dxa"/>
+              <w:left w:w="85" w:type="dxa"/>
+              <w:bottom w:w="85" w:type="dxa"/>
+              <w:right w:w="85" w:type="dxa"/>
+            </w:tcMar>
+          </w:tcPr>
+          <w:p>
+            <w:pPr>
+              <w:spacing w:before="40" w:after="40"/>
+            </w:pPr>
+            <w:r>
+              <w:rPr>
+                <w:b w:val="0"/>
+                <w:sz w:val="18"/>
+              </w:rPr>
+              <w:t>fields 缺失、null 或空对象时跳过。</w:t>
+            </w:r>
+          </w:p>
+        </w:tc>
+      </w:tr>
+      <w:tr>
+        <w:tc>
+          <w:tcPr>
+            <w:tcW w:type="dxa" w:w="2154"/>
+            <w:vAlign w:val="center"/>
+            <w:tcBorders>
+              <w:top w:val="single" w:sz="4" w:color="D9D9D9"/>
+              <w:left w:val="single" w:sz="4" w:color="D9D9D9"/>
+              <w:bottom w:val="single" w:sz="4" w:color="D9D9D9"/>
+              <w:right w:val="single" w:sz="4" w:color="D9D9D9"/>
+            </w:tcBorders>
+            <w:tcMar>
+              <w:top w:w="85" w:type="dxa"/>
+              <w:left w:w="85" w:type="dxa"/>
+              <w:bottom w:w="85" w:type="dxa"/>
+              <w:right w:w="85" w:type="dxa"/>
+            </w:tcMar>
+          </w:tcPr>
+          <w:p>
+            <w:pPr>
+              <w:spacing w:before="40" w:after="40"/>
+            </w:pPr>
+            <w:r>
+              <w:rPr>
+                <w:b w:val="0"/>
+                <w:sz w:val="18"/>
+              </w:rPr>
+              <w:t>公司名</w:t>
+            </w:r>
+          </w:p>
+        </w:tc>
+        <w:tc>
+          <w:tcPr>
+            <w:tcW w:type="dxa" w:w="7483"/>
+            <w:vAlign w:val="center"/>
+            <w:tcBorders>
+              <w:top w:val="single" w:sz="4" w:color="D9D9D9"/>
+              <w:left w:val="single" w:sz="4" w:color="D9D9D9"/>
+              <w:bottom w:val="single" w:sz="4" w:color="D9D9D9"/>
+              <w:right w:val="single" w:sz="4" w:color="D9D9D9"/>
+            </w:tcBorders>
+            <w:tcMar>
+              <w:top w:w="85" w:type="dxa"/>
+              <w:left w:w="85" w:type="dxa"/>
+              <w:bottom w:w="85" w:type="dxa"/>
+              <w:right w:w="85" w:type="dxa"/>
+            </w:tcMar>
+          </w:tcPr>
+          <w:p>
+            <w:pPr>
+              <w:spacing w:before="40" w:after="40"/>
+            </w:pPr>
+            <w:r>
+              <w:rPr>
+                <w:b w:val="0"/>
+                <w:sz w:val="18"/>
+              </w:rPr>
+              <w:t>非空 fields 必须提供非空白公司名，否则报错。</w:t>
+            </w:r>
+          </w:p>
+        </w:tc>
+      </w:tr>
+      <w:tr>
+        <w:tc>
+          <w:tcPr>
+            <w:tcW w:type="dxa" w:w="2154"/>
+            <w:vAlign w:val="center"/>
+            <w:tcBorders>
+              <w:top w:val="single" w:sz="4" w:color="D9D9D9"/>
+              <w:left w:val="single" w:sz="4" w:color="D9D9D9"/>
+              <w:bottom w:val="single" w:sz="4" w:color="D9D9D9"/>
+              <w:right w:val="single" w:sz="4" w:color="D9D9D9"/>
+            </w:tcBorders>
+            <w:tcMar>
+              <w:top w:w="85" w:type="dxa"/>
+              <w:left w:w="85" w:type="dxa"/>
+              <w:bottom w:w="85" w:type="dxa"/>
+              <w:right w:w="85" w:type="dxa"/>
+            </w:tcMar>
+          </w:tcPr>
+          <w:p>
+            <w:pPr>
+              <w:spacing w:before="40" w:after="40"/>
+            </w:pPr>
+            <w:r>
+              <w:rPr>
+                <w:b w:val="0"/>
+                <w:sz w:val="18"/>
+              </w:rPr>
+              <w:t>用户名和密码</w:t>
+            </w:r>
+          </w:p>
+        </w:tc>
+        <w:tc>
+          <w:tcPr>
+            <w:tcW w:type="dxa" w:w="7483"/>
+            <w:vAlign w:val="center"/>
+            <w:tcBorders>
+              <w:top w:val="single" w:sz="4" w:color="D9D9D9"/>
+              <w:left w:val="single" w:sz="4" w:color="D9D9D9"/>
+              <w:bottom w:val="single" w:sz="4" w:color="D9D9D9"/>
+              <w:right w:val="single" w:sz="4" w:color="D9D9D9"/>
+            </w:tcBorders>
+            <w:tcMar>
+              <w:top w:w="85" w:type="dxa"/>
+              <w:left w:w="85" w:type="dxa"/>
+              <w:bottom w:w="85" w:type="dxa"/>
+              <w:right w:w="85" w:type="dxa"/>
+            </w:tcMar>
+          </w:tcPr>
+          <w:p>
+            <w:pPr>
+              <w:spacing w:before="40" w:after="40"/>
+            </w:pPr>
+            <w:r>
+              <w:rPr>
+                <w:b w:val="0"/>
+                <w:sz w:val="18"/>
+              </w:rPr>
+              <w:t>缺失或 null 时输出空字符串；非空字符原样保留，包括密码空格和换行。</w:t>
+            </w:r>
+          </w:p>
+        </w:tc>
+      </w:tr>
+      <w:tr>
+        <w:tc>
+          <w:tcPr>
+            <w:tcW w:type="dxa" w:w="2154"/>
+            <w:vAlign w:val="center"/>
+            <w:tcBorders>
+              <w:top w:val="single" w:sz="4" w:color="D9D9D9"/>
+              <w:left w:val="single" w:sz="4" w:color="D9D9D9"/>
+              <w:bottom w:val="single" w:sz="4" w:color="D9D9D9"/>
+              <w:right w:val="single" w:sz="4" w:color="D9D9D9"/>
+            </w:tcBorders>
+            <w:tcMar>
+              <w:top w:w="85" w:type="dxa"/>
+              <w:left w:w="85" w:type="dxa"/>
+              <w:bottom w:w="85" w:type="dxa"/>
+              <w:right w:w="85" w:type="dxa"/>
+            </w:tcMar>
+          </w:tcPr>
+          <w:p>
+            <w:pPr>
+              <w:spacing w:before="40" w:after="40"/>
+            </w:pPr>
+            <w:r>
+              <w:rPr>
+                <w:b w:val="0"/>
+                <w:sz w:val="18"/>
+              </w:rPr>
+              <w:t>店铺</w:t>
+            </w:r>
+          </w:p>
+        </w:tc>
+        <w:tc>
+          <w:tcPr>
+            <w:tcW w:type="dxa" w:w="7483"/>
+            <w:vAlign w:val="center"/>
+            <w:tcBorders>
+              <w:top w:val="single" w:sz="4" w:color="D9D9D9"/>
+              <w:left w:val="single" w:sz="4" w:color="D9D9D9"/>
+              <w:bottom w:val="single" w:sz="4" w:color="D9D9D9"/>
+              <w:right w:val="single" w:sz="4" w:color="D9D9D9"/>
+            </w:tcBorders>
+            <w:tcMar>
+              <w:top w:w="85" w:type="dxa"/>
+              <w:left w:w="85" w:type="dxa"/>
+              <w:bottom w:w="85" w:type="dxa"/>
+              <w:right w:w="85" w:type="dxa"/>
+            </w:tcMar>
+          </w:tcPr>
+          <w:p>
+            <w:pPr>
+              <w:spacing w:before="40" w:after="40"/>
+            </w:pPr>
+            <w:r>
+              <w:rPr>
+                <w:b w:val="0"/>
+                <w:sz w:val="18"/>
+              </w:rPr>
+              <w:t>缺失、null 或空字符串时取公司名；只有空白字符时报错。</w:t>
+            </w:r>
+          </w:p>
+        </w:tc>
+      </w:tr>
+      <w:tr>
+        <w:tc>
+          <w:tcPr>
+            <w:tcW w:type="dxa" w:w="2154"/>
+            <w:vAlign w:val="center"/>
+            <w:tcBorders>
+              <w:top w:val="single" w:sz="4" w:color="D9D9D9"/>
+              <w:left w:val="single" w:sz="4" w:color="D9D9D9"/>
+              <w:bottom w:val="single" w:sz="4" w:color="D9D9D9"/>
+              <w:right w:val="single" w:sz="4" w:color="D9D9D9"/>
+            </w:tcBorders>
+            <w:tcMar>
+              <w:top w:w="85" w:type="dxa"/>
+              <w:left w:w="85" w:type="dxa"/>
+              <w:bottom w:w="85" w:type="dxa"/>
+              <w:right w:w="85" w:type="dxa"/>
+            </w:tcMar>
+          </w:tcPr>
+          <w:p>
+            <w:pPr>
+              <w:spacing w:before="40" w:after="40"/>
+            </w:pPr>
+            <w:r>
+              <w:rPr>
+                <w:b w:val="0"/>
+                <w:sz w:val="18"/>
+              </w:rPr>
+              <w:t>站点与负责人</w:t>
+            </w:r>
+          </w:p>
+        </w:tc>
+        <w:tc>
+          <w:tcPr>
+            <w:tcW w:type="dxa" w:w="7483"/>
+            <w:vAlign w:val="center"/>
+            <w:tcBorders>
+              <w:top w:val="single" w:sz="4" w:color="D9D9D9"/>
+              <w:left w:val="single" w:sz="4" w:color="D9D9D9"/>
+              <w:bottom w:val="single" w:sz="4" w:color="D9D9D9"/>
+              <w:right w:val="single" w:sz="4" w:color="D9D9D9"/>
+            </w:tcBorders>
+            <w:tcMar>
+              <w:top w:w="85" w:type="dxa"/>
+              <w:left w:w="85" w:type="dxa"/>
+              <w:bottom w:w="85" w:type="dxa"/>
+              <w:right w:w="85" w:type="dxa"/>
+            </w:tcMar>
+          </w:tcPr>
+          <w:p>
+            <w:pPr>
+              <w:spacing w:before="40" w:after="40"/>
+            </w:pPr>
+            <w:r>
+              <w:rPr>
+                <w:b w:val="0"/>
+                <w:sz w:val="18"/>
+              </w:rPr>
+              <w:t>缺失或 null 时为空列表；保留列表原顺序与重复项。</w:t>
+            </w:r>
+          </w:p>
+        </w:tc>
+      </w:tr>
+      <w:tr>
+        <w:tc>
+          <w:tcPr>
+            <w:tcW w:type="dxa" w:w="2154"/>
+            <w:vAlign w:val="center"/>
+            <w:tcBorders>
+              <w:top w:val="single" w:sz="4" w:color="D9D9D9"/>
+              <w:left w:val="single" w:sz="4" w:color="D9D9D9"/>
+              <w:bottom w:val="single" w:sz="4" w:color="D9D9D9"/>
+              <w:right w:val="single" w:sz="4" w:color="D9D9D9"/>
+            </w:tcBorders>
+            <w:tcMar>
+              <w:top w:w="85" w:type="dxa"/>
+              <w:left w:w="85" w:type="dxa"/>
+              <w:bottom w:w="85" w:type="dxa"/>
+              <w:right w:w="85" w:type="dxa"/>
+            </w:tcMar>
+          </w:tcPr>
+          <w:p>
+            <w:pPr>
+              <w:spacing w:before="40" w:after="40"/>
+            </w:pPr>
+            <w:r>
+              <w:rPr>
+                <w:b w:val="0"/>
+                <w:sz w:val="18"/>
+              </w:rPr>
+              <w:t>人员缺失字段</w:t>
+            </w:r>
+          </w:p>
+        </w:tc>
+        <w:tc>
+          <w:tcPr>
+            <w:tcW w:type="dxa" w:w="7483"/>
+            <w:vAlign w:val="center"/>
+            <w:tcBorders>
+              <w:top w:val="single" w:sz="4" w:color="D9D9D9"/>
+              <w:left w:val="single" w:sz="4" w:color="D9D9D9"/>
+              <w:bottom w:val="single" w:sz="4" w:color="D9D9D9"/>
+              <w:right w:val="single" w:sz="4" w:color="D9D9D9"/>
+            </w:tcBorders>
+            <w:tcMar>
+              <w:top w:w="85" w:type="dxa"/>
+              <w:left w:w="85" w:type="dxa"/>
+              <w:bottom w:w="85" w:type="dxa"/>
+              <w:right w:w="85" w:type="dxa"/>
+            </w:tcMar>
+          </w:tcPr>
+          <w:p>
+            <w:pPr>
+              <w:spacing w:before="40" w:after="40"/>
+            </w:pPr>
+            <w:r>
+              <w:rPr>
+                <w:b w:val="0"/>
+                <w:sz w:val="18"/>
+              </w:rPr>
+              <w:t>缺少 name 或 unionId 时以空字符串占位；空人员对象保留两个空字符串。</w:t>
+            </w:r>
+          </w:p>
+        </w:tc>
+      </w:tr>
+      <w:tr>
+        <w:tc>
+          <w:tcPr>
+            <w:tcW w:type="dxa" w:w="2154"/>
+            <w:vAlign w:val="center"/>
+            <w:tcBorders>
+              <w:top w:val="single" w:sz="4" w:color="D9D9D9"/>
+              <w:left w:val="single" w:sz="4" w:color="D9D9D9"/>
+              <w:bottom w:val="single" w:sz="4" w:color="D9D9D9"/>
+              <w:right w:val="single" w:sz="4" w:color="D9D9D9"/>
+            </w:tcBorders>
+            <w:tcMar>
+              <w:top w:w="85" w:type="dxa"/>
+              <w:left w:w="85" w:type="dxa"/>
+              <w:bottom w:w="85" w:type="dxa"/>
+              <w:right w:w="85" w:type="dxa"/>
+            </w:tcMar>
+          </w:tcPr>
+          <w:p>
+            <w:pPr>
+              <w:spacing w:before="40" w:after="40"/>
+            </w:pPr>
+            <w:r>
+              <w:rPr>
+                <w:b w:val="0"/>
+                <w:sz w:val="18"/>
+              </w:rPr>
+              <w:t>错误类型</w:t>
+            </w:r>
+          </w:p>
+        </w:tc>
+        <w:tc>
+          <w:tcPr>
+            <w:tcW w:type="dxa" w:w="7483"/>
+            <w:vAlign w:val="center"/>
+            <w:tcBorders>
+              <w:top w:val="single" w:sz="4" w:color="D9D9D9"/>
+              <w:left w:val="single" w:sz="4" w:color="D9D9D9"/>
+              <w:bottom w:val="single" w:sz="4" w:color="D9D9D9"/>
+              <w:right w:val="single" w:sz="4" w:color="D9D9D9"/>
+            </w:tcBorders>
+            <w:tcMar>
+              <w:top w:w="85" w:type="dxa"/>
+              <w:left w:w="85" w:type="dxa"/>
+              <w:bottom w:w="85" w:type="dxa"/>
+              <w:right w:w="85" w:type="dxa"/>
+            </w:tcMar>
+          </w:tcPr>
+          <w:p>
+            <w:pPr>
+              <w:spacing w:before="40" w:after="40"/>
+            </w:pPr>
+            <w:r>
+              <w:rPr>
+                <w:b w:val="0"/>
+                <w:sz w:val="18"/>
+              </w:rPr>
+              <w:t>记录和字段容器类型错误时立即报错，提示下标与字段位置，不回显输入值。</w:t>
+            </w:r>
+          </w:p>
+        </w:tc>
+      </w:tr>
+    </w:tbl>
+    <w:p>
+      <w:pPr>
+        <w:spacing w:after="0"/>
+      </w:pPr>
+    </w:p>
+    <w:p>
+      <w:r>
+        <w:t>输出中的每个字典和列表均独立，修改某条输出不会改变其他记录或原始输入。七个字段固定存在，店铺名即使与字段名相同，也只作为店铺字段的值保存。</w:t>
+      </w:r>
+    </w:p>
+    <w:p>
+      <w:pPr>
+        <w:pStyle w:val="Heading1"/>
+      </w:pPr>
+      <w:r>
+        <w:t>5 对象包装与分页</w:t>
+      </w:r>
+    </w:p>
+    <w:p>
+      <w:r>
+        <w:t>默认输入必须是列表，不接收打印文本。如果实际返回对象确实包含 data.records，可以显式提取；字段路径仅为示例，以实际节点返回值为准。</w:t>
+      </w:r>
+    </w:p>
+    <w:p>
+      <w:pPr>
+        <w:spacing w:line="252" w:lineRule="auto"/>
+        <w:ind w:left="113"/>
+      </w:pPr>
+      <w:r>
+        <w:rPr>
+          <w:rFonts w:ascii="Consolas" w:hAnsi="Consolas" w:eastAsia="Microsoft YaHei"/>
+          <w:sz w:val="18"/>
+        </w:rPr>
+        <w:t>records = extract_records(iPaas_result, ["data", "records"])</w:t>
+        <w:br/>
+        <w:t>result = transform_records(records)</w:t>
+      </w:r>
+    </w:p>
+    <w:p>
+      <w:r>
+        <w:t>需要所有分页时，先收集所需页面并拼接原始记录列表，再转换一次。重复拉取的页面也会产生重复记录，是否过滤页面由上游决定。函数不会自动请求接口。</w:t>
+      </w:r>
+    </w:p>
+    <w:p>
+      <w:r>
+        <w:br w:type="page"/>
+      </w:r>
+    </w:p>
+    <w:p>
+      <w:pPr>
+        <w:pStyle w:val="Heading1"/>
+      </w:pPr>
+      <w:r>
+        <w:t>6 从旧版迁移</w:t>
+      </w:r>
+    </w:p>
+    <w:p>
+      <w:r>
+        <w:t>旧版按公司和账号合并，店铺名称用作动态键。新版逐条平铺，不合并记录。函数名 transform 保留，但其返回格式也改为新版。旧版代码保留在 Git 历史中。</w:t>
       </w:r>
     </w:p>
     <w:tbl>
@@ -62,14 +1606,14 @@
           </w:tcPr>
           <w:p>
             <w:pPr>
-              <w:spacing w:after="40" w:before="40"/>
+              <w:spacing w:before="40" w:after="40"/>
             </w:pPr>
             <w:r>
               <w:rPr>
                 <w:b/>
                 <w:sz w:val="18"/>
               </w:rPr>
-              <w:t>使用场景</w:t>
+              <w:t>读取内容</w:t>
             </w:r>
           </w:p>
         </w:tc>
@@ -93,14 +1637,14 @@
           </w:tcPr>
           <w:p>
             <w:pPr>
-              <w:spacing w:after="40" w:before="40"/>
+              <w:spacing w:before="40" w:after="40"/>
             </w:pPr>
             <w:r>
               <w:rPr>
                 <w:b/>
                 <w:sz w:val="18"/>
               </w:rPr>
-              <w:t>文件与输出</w:t>
+              <w:t>新版访问方式</w:t>
             </w:r>
           </w:p>
         </w:tc>
@@ -125,14 +1669,14 @@
           </w:tcPr>
           <w:p>
             <w:pPr>
-              <w:spacing w:after="40" w:before="40"/>
+              <w:spacing w:before="40" w:after="40"/>
             </w:pPr>
             <w:r>
               <w:rPr>
                 <w:b w:val="0"/>
                 <w:sz w:val="18"/>
               </w:rPr>
-              <w:t>节点直接执行整段代码</w:t>
+              <w:t>第 i 条店铺名称</w:t>
             </w:r>
           </w:p>
         </w:tc>
@@ -155,16 +1699,14 @@
           </w:tcPr>
           <w:p>
             <w:pPr>
-              <w:spacing w:after="40" w:before="40"/>
+              <w:spacing w:before="40" w:after="40"/>
             </w:pPr>
             <w:r>
               <w:rPr>
                 <w:b w:val="0"/>
                 <w:sz w:val="18"/>
               </w:rPr>
-              <w:t>dingtalk_node.py</w:t>
-              <w:br/>
-              <w:t>末尾生成变量 result</w:t>
+              <w:t>result[i]["店铺"]</w:t>
             </w:r>
           </w:p>
         </w:tc>
@@ -189,14 +1731,14 @@
           </w:tcPr>
           <w:p>
             <w:pPr>
-              <w:spacing w:after="40" w:before="40"/>
+              <w:spacing w:before="40" w:after="40"/>
             </w:pPr>
             <w:r>
               <w:rPr>
                 <w:b w:val="0"/>
                 <w:sz w:val="18"/>
               </w:rPr>
-              <w:t>节点要求函数入口</w:t>
+              <w:t>第 i 条站点列表</w:t>
             </w:r>
           </w:p>
         </w:tc>
@@ -219,16 +1761,14 @@
           </w:tcPr>
           <w:p>
             <w:pPr>
-              <w:spacing w:after="40" w:before="40"/>
+              <w:spacing w:before="40" w:after="40"/>
             </w:pPr>
             <w:r>
               <w:rPr>
                 <w:b w:val="0"/>
                 <w:sz w:val="18"/>
               </w:rPr>
-              <w:t>dingtalk_transform.py</w:t>
-              <w:br/>
-              <w:t>main(iPaas_result) 返回含 result 的对象</w:t>
+              <w:t>result[i]["站点"]</w:t>
             </w:r>
           </w:p>
         </w:tc>
@@ -253,14 +1793,14 @@
           </w:tcPr>
           <w:p>
             <w:pPr>
-              <w:spacing w:after="40" w:before="40"/>
+              <w:spacing w:before="40" w:after="40"/>
             </w:pPr>
             <w:r>
               <w:rPr>
                 <w:b w:val="0"/>
                 <w:sz w:val="18"/>
               </w:rPr>
-              <w:t>本地程序导入函数</w:t>
+              <w:t>第 i 条负责人标识</w:t>
             </w:r>
           </w:p>
         </w:tc>
@@ -283,160 +1823,14 @@
           </w:tcPr>
           <w:p>
             <w:pPr>
-              <w:spacing w:after="40" w:before="40"/>
+              <w:spacing w:before="40" w:after="40"/>
             </w:pPr>
             <w:r>
               <w:rPr>
                 <w:b w:val="0"/>
                 <w:sz w:val="18"/>
               </w:rPr>
-              <w:t>dingtalk_transform.py</w:t>
-              <w:br/>
-              <w:t>调用 transform(records) 返回列表</w:t>
-            </w:r>
-          </w:p>
-        </w:tc>
-      </w:tr>
-    </w:tbl>
-    <w:p>
-      <w:pPr>
-        <w:spacing w:after="0"/>
-      </w:pPr>
-    </w:p>
-    <w:p>
-      <w:pPr>
-        <w:pStyle w:val="Heading1"/>
-      </w:pPr>
-      <w:r>
-        <w:t>2 在流程中接入</w:t>
-      </w:r>
-    </w:p>
-    <w:p>
-      <w:r>
-        <w:t>① 在 Python 节点中添加输入参数 iPaas_result，绑定“获取多行记录”步骤返回的记录列表。上一步结果的变量名不会自动成为代码节点输入。</w:t>
-      </w:r>
-    </w:p>
-    <w:p>
-      <w:r>
-        <w:t>② 直接执行式节点粘贴 dingtalk_node.py 全文。函数式节点使用另一个文件，并按平台规定适配函数名和参数签名。两种入口选一种。</w:t>
-      </w:r>
-    </w:p>
-    <w:p>
-      <w:r>
-        <w:t>③ 将输出 result 配置为数组或列表；只支持通用 JSON 的节点可使用 JSON。后续步骤引用代码节点的 result 输出。</w:t>
-      </w:r>
-    </w:p>
-    <w:p>
-      <w:pPr>
-        <w:spacing w:line="252" w:lineRule="auto"/>
-        <w:ind w:left="113"/>
-      </w:pPr>
-      <w:r>
-        <w:rPr>
-          <w:rFonts w:ascii="Consolas" w:hAnsi="Consolas" w:eastAsia="Microsoft YaHei"/>
-          <w:sz w:val="18"/>
-        </w:rPr>
-        <w:t># 直接执行式节点末尾已有这一行</w:t>
-        <w:br/>
-        <w:t>result = transform(iPaas_result)</w:t>
-      </w:r>
-    </w:p>
-    <w:p>
-      <w:r>
-        <w:t>平台的函数名、输入上下文和输出声明方式由实际代码节点决定。交付代码已完成本地验证，接入后仍需在你的钉钉流程中运行一次确认绑定。</w:t>
-      </w:r>
-    </w:p>
-    <w:p>
-      <w:r>
-        <w:br w:type="page"/>
-      </w:r>
-    </w:p>
-    <w:p>
-      <w:pPr>
-        <w:pStyle w:val="Heading1"/>
-      </w:pPr>
-      <w:r>
-        <w:t>3 输入输出格式</w:t>
-      </w:r>
-    </w:p>
-    <w:p>
-      <w:r>
-        <w:t>输入为列表，每一项是含 fields 的记录对象；输出仍是列表。每个输出元素代表一组公司和账号，不是单个店铺。</w:t>
-      </w:r>
-    </w:p>
-    <w:tbl>
-      <w:tblPr>
-        <w:tblW w:type="auto" w:w="0"/>
-        <w:tblLayout w:type="fixed"/>
-        <w:tblLook w:firstColumn="1" w:firstRow="1" w:lastColumn="0" w:lastRow="0" w:noHBand="0" w:noVBand="1" w:val="04A0"/>
-      </w:tblPr>
-      <w:tblGrid>
-        <w:gridCol w:w="4706"/>
-        <w:gridCol w:w="4932"/>
-      </w:tblGrid>
-      <w:tr>
-        <w:trPr>
-          <w:tblHeader/>
-        </w:trPr>
-        <w:tc>
-          <w:tcPr>
-            <w:tcW w:type="dxa" w:w="4706"/>
-            <w:vAlign w:val="center"/>
-            <w:tcBorders>
-              <w:top w:val="single" w:sz="4" w:color="D9D9D9"/>
-              <w:left w:val="single" w:sz="4" w:color="D9D9D9"/>
-              <w:bottom w:val="single" w:sz="4" w:color="D9D9D9"/>
-              <w:right w:val="single" w:sz="4" w:color="D9D9D9"/>
-            </w:tcBorders>
-            <w:tcMar>
-              <w:top w:w="85" w:type="dxa"/>
-              <w:left w:w="85" w:type="dxa"/>
-              <w:bottom w:w="85" w:type="dxa"/>
-              <w:right w:w="85" w:type="dxa"/>
-            </w:tcMar>
-            <w:shd w:fill="E8EEF4"/>
-          </w:tcPr>
-          <w:p>
-            <w:pPr>
-              <w:spacing w:after="40" w:before="40"/>
-            </w:pPr>
-            <w:r>
-              <w:rPr>
-                <w:b/>
-                <w:sz w:val="18"/>
-              </w:rPr>
-              <w:t>输入字段</w:t>
-            </w:r>
-          </w:p>
-        </w:tc>
-        <w:tc>
-          <w:tcPr>
-            <w:tcW w:type="dxa" w:w="4932"/>
-            <w:vAlign w:val="center"/>
-            <w:tcBorders>
-              <w:top w:val="single" w:sz="4" w:color="D9D9D9"/>
-              <w:left w:val="single" w:sz="4" w:color="D9D9D9"/>
-              <w:bottom w:val="single" w:sz="4" w:color="D9D9D9"/>
-              <w:right w:val="single" w:sz="4" w:color="D9D9D9"/>
-            </w:tcBorders>
-            <w:tcMar>
-              <w:top w:w="85" w:type="dxa"/>
-              <w:left w:w="85" w:type="dxa"/>
-              <w:bottom w:w="85" w:type="dxa"/>
-              <w:right w:w="85" w:type="dxa"/>
-            </w:tcMar>
-            <w:shd w:fill="E8EEF4"/>
-          </w:tcPr>
-          <w:p>
-            <w:pPr>
-              <w:spacing w:after="40" w:before="40"/>
-            </w:pPr>
-            <w:r>
-              <w:rPr>
-                <w:b/>
-                <w:sz w:val="18"/>
-              </w:rPr>
-              <w:t>输出位置</w:t>
+              <w:t>result[i]["unionId"]</w:t>
             </w:r>
           </w:p>
         </w:tc>
@@ -444,7 +1838,7 @@
       <w:tr>
         <w:tc>
           <w:tcPr>
-            <w:tcW w:type="dxa" w:w="4706"/>
+            <w:tcW w:type="dxa" w:w="3402"/>
             <w:vAlign w:val="center"/>
             <w:tcBorders>
               <w:top w:val="single" w:sz="4" w:color="D9D9D9"/>
@@ -461,20 +1855,20 @@
           </w:tcPr>
           <w:p>
             <w:pPr>
-              <w:spacing w:after="40" w:before="40"/>
+              <w:spacing w:before="40" w:after="40"/>
             </w:pPr>
             <w:r>
               <w:rPr>
                 <w:b w:val="0"/>
                 <w:sz w:val="18"/>
               </w:rPr>
-              <w:t>fields.公司名</w:t>
+              <w:t>第 i 条负责人姓名</w:t>
             </w:r>
           </w:p>
         </w:tc>
         <w:tc>
           <w:tcPr>
-            <w:tcW w:type="dxa" w:w="4932"/>
+            <w:tcW w:type="dxa" w:w="6236"/>
             <w:vAlign w:val="center"/>
             <w:tcBorders>
               <w:top w:val="single" w:sz="4" w:color="D9D9D9"/>
@@ -491,386 +1885,14 @@
           </w:tcPr>
           <w:p>
             <w:pPr>
-              <w:spacing w:after="40" w:before="40"/>
+              <w:spacing w:before="40" w:after="40"/>
             </w:pPr>
             <w:r>
               <w:rPr>
                 <w:b w:val="0"/>
                 <w:sz w:val="18"/>
               </w:rPr>
-              <w:t>公司名</w:t>
-            </w:r>
-          </w:p>
-        </w:tc>
-      </w:tr>
-      <w:tr>
-        <w:tc>
-          <w:tcPr>
-            <w:tcW w:type="dxa" w:w="4706"/>
-            <w:vAlign w:val="center"/>
-            <w:tcBorders>
-              <w:top w:val="single" w:sz="4" w:color="D9D9D9"/>
-              <w:left w:val="single" w:sz="4" w:color="D9D9D9"/>
-              <w:bottom w:val="single" w:sz="4" w:color="D9D9D9"/>
-              <w:right w:val="single" w:sz="4" w:color="D9D9D9"/>
-            </w:tcBorders>
-            <w:tcMar>
-              <w:top w:w="85" w:type="dxa"/>
-              <w:left w:w="85" w:type="dxa"/>
-              <w:bottom w:w="85" w:type="dxa"/>
-              <w:right w:w="85" w:type="dxa"/>
-            </w:tcMar>
-          </w:tcPr>
-          <w:p>
-            <w:pPr>
-              <w:spacing w:after="40" w:before="40"/>
-            </w:pPr>
-            <w:r>
-              <w:rPr>
-                <w:b w:val="0"/>
-                <w:sz w:val="18"/>
-              </w:rPr>
-              <w:t>fields.企业用户名</w:t>
-            </w:r>
-          </w:p>
-        </w:tc>
-        <w:tc>
-          <w:tcPr>
-            <w:tcW w:type="dxa" w:w="4932"/>
-            <w:vAlign w:val="center"/>
-            <w:tcBorders>
-              <w:top w:val="single" w:sz="4" w:color="D9D9D9"/>
-              <w:left w:val="single" w:sz="4" w:color="D9D9D9"/>
-              <w:bottom w:val="single" w:sz="4" w:color="D9D9D9"/>
-              <w:right w:val="single" w:sz="4" w:color="D9D9D9"/>
-            </w:tcBorders>
-            <w:tcMar>
-              <w:top w:w="85" w:type="dxa"/>
-              <w:left w:w="85" w:type="dxa"/>
-              <w:bottom w:w="85" w:type="dxa"/>
-              <w:right w:w="85" w:type="dxa"/>
-            </w:tcMar>
-          </w:tcPr>
-          <w:p>
-            <w:pPr>
-              <w:spacing w:after="40" w:before="40"/>
-            </w:pPr>
-            <w:r>
-              <w:rPr>
-                <w:b w:val="0"/>
-                <w:sz w:val="18"/>
-              </w:rPr>
-              <w:t>企业用户名</w:t>
-            </w:r>
-          </w:p>
-        </w:tc>
-      </w:tr>
-      <w:tr>
-        <w:tc>
-          <w:tcPr>
-            <w:tcW w:type="dxa" w:w="4706"/>
-            <w:vAlign w:val="center"/>
-            <w:tcBorders>
-              <w:top w:val="single" w:sz="4" w:color="D9D9D9"/>
-              <w:left w:val="single" w:sz="4" w:color="D9D9D9"/>
-              <w:bottom w:val="single" w:sz="4" w:color="D9D9D9"/>
-              <w:right w:val="single" w:sz="4" w:color="D9D9D9"/>
-            </w:tcBorders>
-            <w:tcMar>
-              <w:top w:w="85" w:type="dxa"/>
-              <w:left w:w="85" w:type="dxa"/>
-              <w:bottom w:w="85" w:type="dxa"/>
-              <w:right w:w="85" w:type="dxa"/>
-            </w:tcMar>
-          </w:tcPr>
-          <w:p>
-            <w:pPr>
-              <w:spacing w:after="40" w:before="40"/>
-            </w:pPr>
-            <w:r>
-              <w:rPr>
-                <w:b w:val="0"/>
-                <w:sz w:val="18"/>
-              </w:rPr>
-              <w:t>fields.企业密码</w:t>
-            </w:r>
-          </w:p>
-        </w:tc>
-        <w:tc>
-          <w:tcPr>
-            <w:tcW w:type="dxa" w:w="4932"/>
-            <w:vAlign w:val="center"/>
-            <w:tcBorders>
-              <w:top w:val="single" w:sz="4" w:color="D9D9D9"/>
-              <w:left w:val="single" w:sz="4" w:color="D9D9D9"/>
-              <w:bottom w:val="single" w:sz="4" w:color="D9D9D9"/>
-              <w:right w:val="single" w:sz="4" w:color="D9D9D9"/>
-            </w:tcBorders>
-            <w:tcMar>
-              <w:top w:w="85" w:type="dxa"/>
-              <w:left w:w="85" w:type="dxa"/>
-              <w:bottom w:w="85" w:type="dxa"/>
-              <w:right w:w="85" w:type="dxa"/>
-            </w:tcMar>
-          </w:tcPr>
-          <w:p>
-            <w:pPr>
-              <w:spacing w:after="40" w:before="40"/>
-            </w:pPr>
-            <w:r>
-              <w:rPr>
-                <w:b w:val="0"/>
-                <w:sz w:val="18"/>
-              </w:rPr>
-              <w:t>企业密码</w:t>
-            </w:r>
-          </w:p>
-        </w:tc>
-      </w:tr>
-      <w:tr>
-        <w:tc>
-          <w:tcPr>
-            <w:tcW w:type="dxa" w:w="4706"/>
-            <w:vAlign w:val="center"/>
-            <w:tcBorders>
-              <w:top w:val="single" w:sz="4" w:color="D9D9D9"/>
-              <w:left w:val="single" w:sz="4" w:color="D9D9D9"/>
-              <w:bottom w:val="single" w:sz="4" w:color="D9D9D9"/>
-              <w:right w:val="single" w:sz="4" w:color="D9D9D9"/>
-            </w:tcBorders>
-            <w:tcMar>
-              <w:top w:w="85" w:type="dxa"/>
-              <w:left w:w="85" w:type="dxa"/>
-              <w:bottom w:w="85" w:type="dxa"/>
-              <w:right w:w="85" w:type="dxa"/>
-            </w:tcMar>
-          </w:tcPr>
-          <w:p>
-            <w:pPr>
-              <w:spacing w:after="40" w:before="40"/>
-            </w:pPr>
-            <w:r>
-              <w:rPr>
-                <w:b w:val="0"/>
-                <w:sz w:val="18"/>
-              </w:rPr>
-              <w:t>fields.店铺</w:t>
-            </w:r>
-          </w:p>
-        </w:tc>
-        <w:tc>
-          <w:tcPr>
-            <w:tcW w:type="dxa" w:w="4932"/>
-            <w:vAlign w:val="center"/>
-            <w:tcBorders>
-              <w:top w:val="single" w:sz="4" w:color="D9D9D9"/>
-              <w:left w:val="single" w:sz="4" w:color="D9D9D9"/>
-              <w:bottom w:val="single" w:sz="4" w:color="D9D9D9"/>
-              <w:right w:val="single" w:sz="4" w:color="D9D9D9"/>
-            </w:tcBorders>
-            <w:tcMar>
-              <w:top w:w="85" w:type="dxa"/>
-              <w:left w:w="85" w:type="dxa"/>
-              <w:bottom w:w="85" w:type="dxa"/>
-              <w:right w:w="85" w:type="dxa"/>
-            </w:tcMar>
-          </w:tcPr>
-          <w:p>
-            <w:pPr>
-              <w:spacing w:after="40" w:before="40"/>
-            </w:pPr>
-            <w:r>
-              <w:rPr>
-                <w:b w:val="0"/>
-                <w:sz w:val="18"/>
-              </w:rPr>
-              <w:t>公司对象下的动态店铺键</w:t>
-            </w:r>
-          </w:p>
-        </w:tc>
-      </w:tr>
-      <w:tr>
-        <w:tc>
-          <w:tcPr>
-            <w:tcW w:type="dxa" w:w="4706"/>
-            <w:vAlign w:val="center"/>
-            <w:tcBorders>
-              <w:top w:val="single" w:sz="4" w:color="D9D9D9"/>
-              <w:left w:val="single" w:sz="4" w:color="D9D9D9"/>
-              <w:bottom w:val="single" w:sz="4" w:color="D9D9D9"/>
-              <w:right w:val="single" w:sz="4" w:color="D9D9D9"/>
-            </w:tcBorders>
-            <w:tcMar>
-              <w:top w:w="85" w:type="dxa"/>
-              <w:left w:w="85" w:type="dxa"/>
-              <w:bottom w:w="85" w:type="dxa"/>
-              <w:right w:w="85" w:type="dxa"/>
-            </w:tcMar>
-          </w:tcPr>
-          <w:p>
-            <w:pPr>
-              <w:spacing w:after="40" w:before="40"/>
-            </w:pPr>
-            <w:r>
-              <w:rPr>
-                <w:b w:val="0"/>
-                <w:sz w:val="18"/>
-              </w:rPr>
-              <w:t>fields.站点[*].name</w:t>
-            </w:r>
-          </w:p>
-        </w:tc>
-        <w:tc>
-          <w:tcPr>
-            <w:tcW w:type="dxa" w:w="4932"/>
-            <w:vAlign w:val="center"/>
-            <w:tcBorders>
-              <w:top w:val="single" w:sz="4" w:color="D9D9D9"/>
-              <w:left w:val="single" w:sz="4" w:color="D9D9D9"/>
-              <w:bottom w:val="single" w:sz="4" w:color="D9D9D9"/>
-              <w:right w:val="single" w:sz="4" w:color="D9D9D9"/>
-            </w:tcBorders>
-            <w:tcMar>
-              <w:top w:w="85" w:type="dxa"/>
-              <w:left w:w="85" w:type="dxa"/>
-              <w:bottom w:w="85" w:type="dxa"/>
-              <w:right w:w="85" w:type="dxa"/>
-            </w:tcMar>
-          </w:tcPr>
-          <w:p>
-            <w:pPr>
-              <w:spacing w:after="40" w:before="40"/>
-            </w:pPr>
-            <w:r>
-              <w:rPr>
-                <w:b w:val="0"/>
-                <w:sz w:val="18"/>
-              </w:rPr>
-              <w:t>店铺对象下的站点列表</w:t>
-            </w:r>
-          </w:p>
-        </w:tc>
-      </w:tr>
-      <w:tr>
-        <w:tc>
-          <w:tcPr>
-            <w:tcW w:type="dxa" w:w="4706"/>
-            <w:vAlign w:val="center"/>
-            <w:tcBorders>
-              <w:top w:val="single" w:sz="4" w:color="D9D9D9"/>
-              <w:left w:val="single" w:sz="4" w:color="D9D9D9"/>
-              <w:bottom w:val="single" w:sz="4" w:color="D9D9D9"/>
-              <w:right w:val="single" w:sz="4" w:color="D9D9D9"/>
-            </w:tcBorders>
-            <w:tcMar>
-              <w:top w:w="85" w:type="dxa"/>
-              <w:left w:w="85" w:type="dxa"/>
-              <w:bottom w:w="85" w:type="dxa"/>
-              <w:right w:w="85" w:type="dxa"/>
-            </w:tcMar>
-          </w:tcPr>
-          <w:p>
-            <w:pPr>
-              <w:spacing w:after="40" w:before="40"/>
-            </w:pPr>
-            <w:r>
-              <w:rPr>
-                <w:b w:val="0"/>
-                <w:sz w:val="18"/>
-              </w:rPr>
-              <w:t>fields.运营负责人[*].unionId</w:t>
-            </w:r>
-          </w:p>
-        </w:tc>
-        <w:tc>
-          <w:tcPr>
-            <w:tcW w:type="dxa" w:w="4932"/>
-            <w:vAlign w:val="center"/>
-            <w:tcBorders>
-              <w:top w:val="single" w:sz="4" w:color="D9D9D9"/>
-              <w:left w:val="single" w:sz="4" w:color="D9D9D9"/>
-              <w:bottom w:val="single" w:sz="4" w:color="D9D9D9"/>
-              <w:right w:val="single" w:sz="4" w:color="D9D9D9"/>
-            </w:tcBorders>
-            <w:tcMar>
-              <w:top w:w="85" w:type="dxa"/>
-              <w:left w:w="85" w:type="dxa"/>
-              <w:bottom w:w="85" w:type="dxa"/>
-              <w:right w:w="85" w:type="dxa"/>
-            </w:tcMar>
-          </w:tcPr>
-          <w:p>
-            <w:pPr>
-              <w:spacing w:after="40" w:before="40"/>
-            </w:pPr>
-            <w:r>
-              <w:rPr>
-                <w:b w:val="0"/>
-                <w:sz w:val="18"/>
-              </w:rPr>
-              <w:t>店铺对象下的 unionId 列表</w:t>
-            </w:r>
-          </w:p>
-        </w:tc>
-      </w:tr>
-      <w:tr>
-        <w:tc>
-          <w:tcPr>
-            <w:tcW w:type="dxa" w:w="4706"/>
-            <w:vAlign w:val="center"/>
-            <w:tcBorders>
-              <w:top w:val="single" w:sz="4" w:color="D9D9D9"/>
-              <w:left w:val="single" w:sz="4" w:color="D9D9D9"/>
-              <w:bottom w:val="single" w:sz="4" w:color="D9D9D9"/>
-              <w:right w:val="single" w:sz="4" w:color="D9D9D9"/>
-            </w:tcBorders>
-            <w:tcMar>
-              <w:top w:w="85" w:type="dxa"/>
-              <w:left w:w="85" w:type="dxa"/>
-              <w:bottom w:w="85" w:type="dxa"/>
-              <w:right w:w="85" w:type="dxa"/>
-            </w:tcMar>
-          </w:tcPr>
-          <w:p>
-            <w:pPr>
-              <w:spacing w:after="40" w:before="40"/>
-            </w:pPr>
-            <w:r>
-              <w:rPr>
-                <w:b w:val="0"/>
-                <w:sz w:val="18"/>
-              </w:rPr>
-              <w:t>fields.运营负责人[*].name</w:t>
-            </w:r>
-          </w:p>
-        </w:tc>
-        <w:tc>
-          <w:tcPr>
-            <w:tcW w:type="dxa" w:w="4932"/>
-            <w:vAlign w:val="center"/>
-            <w:tcBorders>
-              <w:top w:val="single" w:sz="4" w:color="D9D9D9"/>
-              <w:left w:val="single" w:sz="4" w:color="D9D9D9"/>
-              <w:bottom w:val="single" w:sz="4" w:color="D9D9D9"/>
-              <w:right w:val="single" w:sz="4" w:color="D9D9D9"/>
-            </w:tcBorders>
-            <w:tcMar>
-              <w:top w:w="85" w:type="dxa"/>
-              <w:left w:w="85" w:type="dxa"/>
-              <w:bottom w:w="85" w:type="dxa"/>
-              <w:right w:w="85" w:type="dxa"/>
-            </w:tcMar>
-          </w:tcPr>
-          <w:p>
-            <w:pPr>
-              <w:spacing w:after="40" w:before="40"/>
-            </w:pPr>
-            <w:r>
-              <w:rPr>
-                <w:b w:val="0"/>
-                <w:sz w:val="18"/>
-              </w:rPr>
-              <w:t>店铺对象下的 name 列表</w:t>
+              <w:t>result[i]["name"]</w:t>
             </w:r>
           </w:p>
         </w:tc>
@@ -883,7 +1905,15 @@
     </w:p>
     <w:p>
       <w:r>
-        <w:t>示例输出如下。包内公司、人员、账号、密码和标识均为虚构测试值；真实转换会保留原始密码。</w:t>
+        <w:t>下游不应将公司名或店铺名视为唯一键，也不应使用唯一店铺数判断输出数量。直接执行式和函数式入口选择一种，不能同时附加两套未绑定的调用。</w:t>
+      </w:r>
+    </w:p>
+    <w:p>
+      <w:pPr>
+        <w:pStyle w:val="Heading1"/>
+      </w:pPr>
+      <w:r>
+        <w:t>7 验证与排错</w:t>
       </w:r>
     </w:p>
     <w:p>
@@ -896,44 +1926,19 @@
           <w:rFonts w:ascii="Consolas" w:hAnsi="Consolas" w:eastAsia="Microsoft YaHei"/>
           <w:sz w:val="18"/>
         </w:rPr>
-        <w:t>[</w:t>
+        <w:t># 在仓库根目录执行</w:t>
         <w:br/>
-        <w:t xml:space="preserve">  {</w:t>
-        <w:br/>
-        <w:t xml:space="preserve">    "公司名": "示例医疗公司",</w:t>
-        <w:br/>
-        <w:t xml:space="preserve">    "企业用户名": "demo_medical",</w:t>
-        <w:br/>
-        <w:t xml:space="preserve">    "企业密码": "DemoOnly}|#2026",</w:t>
-        <w:br/>
-        <w:t xml:space="preserve">    "示例医疗店": {</w:t>
-        <w:br/>
-        <w:t xml:space="preserve">      "站点": ["美国", "加拿大", "墨西哥"],</w:t>
-        <w:br/>
-        <w:t xml:space="preserve">      "unionId": ["demo_u01"],</w:t>
-        <w:br/>
-        <w:t xml:space="preserve">      "name": ["负责人甲"]</w:t>
-        <w:br/>
-        <w:t xml:space="preserve">    }</w:t>
-        <w:br/>
-        <w:t xml:space="preserve">  }</w:t>
-        <w:br/>
-        <w:t>]</w:t>
+        <w:t>python -m unittest discover -s projects/dingtalk-record-transform -v</w:t>
       </w:r>
     </w:p>
     <w:p>
       <w:r>
-        <w:t>完整数据见 examples/input.json 和 examples/output.json。main 的返回对象见 examples/main_output.json，外层多一层 result 字段。</w:t>
+        <w:t>测试覆盖固定字段、重复记录保留、列表顺序、跨记录隔离、密码字符保留、缺失字段、输入类型、节点入口和示例一致性。最新结果见验收结果.txt。</w:t>
       </w:r>
     </w:p>
     <w:p>
       <w:r>
-        <w:t>创建人、修改人、时间戳、记录 id 和站点 id 不进入输出。负责人仅取“运营负责人”，不会用其他人员字段替代。</w:t>
-      </w:r>
-    </w:p>
-    <w:p>
-      <w:r>
-        <w:br w:type="page"/>
+        <w:t>iPaas_result 未定义时检查输入映射；提示需要列表时检查绑定的层级；节点没有输出时检查函数入口和 result 输出声明。结构定义不能单独表达人员列表等长，此关系由代码与测试保证。</w:t>
       </w:r>
     </w:p>
     <w:p>
@@ -941,1093 +1946,17 @@
         <w:pStyle w:val="Heading1"/>
       </w:pPr>
       <w:r>
-        <w:t>4 合并与缺失值规则</w:t>
-      </w:r>
-    </w:p>
-    <w:tbl>
-      <w:tblPr>
-        <w:tblW w:type="auto" w:w="0"/>
-        <w:tblLayout w:type="fixed"/>
-        <w:tblLook w:firstColumn="1" w:firstRow="1" w:lastColumn="0" w:lastRow="0" w:noHBand="0" w:noVBand="1" w:val="04A0"/>
-      </w:tblPr>
-      <w:tblGrid>
-        <w:gridCol w:w="2098"/>
-        <w:gridCol w:w="7540"/>
-      </w:tblGrid>
-      <w:tr>
-        <w:trPr>
-          <w:tblHeader/>
-        </w:trPr>
-        <w:tc>
-          <w:tcPr>
-            <w:tcW w:type="dxa" w:w="2098"/>
-            <w:vAlign w:val="center"/>
-            <w:tcBorders>
-              <w:top w:val="single" w:sz="4" w:color="D9D9D9"/>
-              <w:left w:val="single" w:sz="4" w:color="D9D9D9"/>
-              <w:bottom w:val="single" w:sz="4" w:color="D9D9D9"/>
-              <w:right w:val="single" w:sz="4" w:color="D9D9D9"/>
-            </w:tcBorders>
-            <w:tcMar>
-              <w:top w:w="85" w:type="dxa"/>
-              <w:left w:w="85" w:type="dxa"/>
-              <w:bottom w:w="85" w:type="dxa"/>
-              <w:right w:w="85" w:type="dxa"/>
-            </w:tcMar>
-            <w:shd w:fill="E8EEF4"/>
-          </w:tcPr>
-          <w:p>
-            <w:pPr>
-              <w:spacing w:after="40" w:before="40"/>
-            </w:pPr>
-            <w:r>
-              <w:rPr>
-                <w:b/>
-                <w:sz w:val="18"/>
-              </w:rPr>
-              <w:t>项目</w:t>
-            </w:r>
-          </w:p>
-        </w:tc>
-        <w:tc>
-          <w:tcPr>
-            <w:tcW w:type="dxa" w:w="7540"/>
-            <w:vAlign w:val="center"/>
-            <w:tcBorders>
-              <w:top w:val="single" w:sz="4" w:color="D9D9D9"/>
-              <w:left w:val="single" w:sz="4" w:color="D9D9D9"/>
-              <w:bottom w:val="single" w:sz="4" w:color="D9D9D9"/>
-              <w:right w:val="single" w:sz="4" w:color="D9D9D9"/>
-            </w:tcBorders>
-            <w:tcMar>
-              <w:top w:w="85" w:type="dxa"/>
-              <w:left w:w="85" w:type="dxa"/>
-              <w:bottom w:w="85" w:type="dxa"/>
-              <w:right w:w="85" w:type="dxa"/>
-            </w:tcMar>
-            <w:shd w:fill="E8EEF4"/>
-          </w:tcPr>
-          <w:p>
-            <w:pPr>
-              <w:spacing w:after="40" w:before="40"/>
-            </w:pPr>
-            <w:r>
-              <w:rPr>
-                <w:b/>
-                <w:sz w:val="18"/>
-              </w:rPr>
-              <w:t>处理方式</w:t>
-            </w:r>
-          </w:p>
-        </w:tc>
-      </w:tr>
-      <w:tr>
-        <w:tc>
-          <w:tcPr>
-            <w:tcW w:type="dxa" w:w="2098"/>
-            <w:vAlign w:val="center"/>
-            <w:tcBorders>
-              <w:top w:val="single" w:sz="4" w:color="D9D9D9"/>
-              <w:left w:val="single" w:sz="4" w:color="D9D9D9"/>
-              <w:bottom w:val="single" w:sz="4" w:color="D9D9D9"/>
-              <w:right w:val="single" w:sz="4" w:color="D9D9D9"/>
-            </w:tcBorders>
-            <w:tcMar>
-              <w:top w:w="85" w:type="dxa"/>
-              <w:left w:w="85" w:type="dxa"/>
-              <w:bottom w:w="85" w:type="dxa"/>
-              <w:right w:w="85" w:type="dxa"/>
-            </w:tcMar>
-          </w:tcPr>
-          <w:p>
-            <w:pPr>
-              <w:spacing w:after="40" w:before="40"/>
-            </w:pPr>
-            <w:r>
-              <w:rPr>
-                <w:b w:val="0"/>
-                <w:sz w:val="18"/>
-              </w:rPr>
-              <w:t>公司和账号分组</w:t>
-            </w:r>
-          </w:p>
-        </w:tc>
-        <w:tc>
-          <w:tcPr>
-            <w:tcW w:type="dxa" w:w="7540"/>
-            <w:vAlign w:val="center"/>
-            <w:tcBorders>
-              <w:top w:val="single" w:sz="4" w:color="D9D9D9"/>
-              <w:left w:val="single" w:sz="4" w:color="D9D9D9"/>
-              <w:bottom w:val="single" w:sz="4" w:color="D9D9D9"/>
-              <w:right w:val="single" w:sz="4" w:color="D9D9D9"/>
-            </w:tcBorders>
-            <w:tcMar>
-              <w:top w:w="85" w:type="dxa"/>
-              <w:left w:w="85" w:type="dxa"/>
-              <w:bottom w:w="85" w:type="dxa"/>
-              <w:right w:w="85" w:type="dxa"/>
-            </w:tcMar>
-          </w:tcPr>
-          <w:p>
-            <w:pPr>
-              <w:spacing w:after="40" w:before="40"/>
-            </w:pPr>
-            <w:r>
-              <w:rPr>
-                <w:b w:val="0"/>
-                <w:sz w:val="18"/>
-              </w:rPr>
-              <w:t>按公司名、企业用户名、企业密码的精确值分组；不同密码不会互相覆盖。</w:t>
-            </w:r>
-          </w:p>
-        </w:tc>
-      </w:tr>
-      <w:tr>
-        <w:tc>
-          <w:tcPr>
-            <w:tcW w:type="dxa" w:w="2098"/>
-            <w:vAlign w:val="center"/>
-            <w:tcBorders>
-              <w:top w:val="single" w:sz="4" w:color="D9D9D9"/>
-              <w:left w:val="single" w:sz="4" w:color="D9D9D9"/>
-              <w:bottom w:val="single" w:sz="4" w:color="D9D9D9"/>
-              <w:right w:val="single" w:sz="4" w:color="D9D9D9"/>
-            </w:tcBorders>
-            <w:tcMar>
-              <w:top w:w="85" w:type="dxa"/>
-              <w:left w:w="85" w:type="dxa"/>
-              <w:bottom w:w="85" w:type="dxa"/>
-              <w:right w:w="85" w:type="dxa"/>
-            </w:tcMar>
-          </w:tcPr>
-          <w:p>
-            <w:pPr>
-              <w:spacing w:after="40" w:before="40"/>
-            </w:pPr>
-            <w:r>
-              <w:rPr>
-                <w:b w:val="0"/>
-                <w:sz w:val="18"/>
-              </w:rPr>
-              <w:t>同组内的店铺</w:t>
-            </w:r>
-          </w:p>
-        </w:tc>
-        <w:tc>
-          <w:tcPr>
-            <w:tcW w:type="dxa" w:w="7540"/>
-            <w:vAlign w:val="center"/>
-            <w:tcBorders>
-              <w:top w:val="single" w:sz="4" w:color="D9D9D9"/>
-              <w:left w:val="single" w:sz="4" w:color="D9D9D9"/>
-              <w:bottom w:val="single" w:sz="4" w:color="D9D9D9"/>
-              <w:right w:val="single" w:sz="4" w:color="D9D9D9"/>
-            </w:tcBorders>
-            <w:tcMar>
-              <w:top w:w="85" w:type="dxa"/>
-              <w:left w:w="85" w:type="dxa"/>
-              <w:bottom w:w="85" w:type="dxa"/>
-              <w:right w:w="85" w:type="dxa"/>
-            </w:tcMar>
-          </w:tcPr>
-          <w:p>
-            <w:pPr>
-              <w:spacing w:after="40" w:before="40"/>
-            </w:pPr>
-            <w:r>
-              <w:rPr>
-                <w:b w:val="0"/>
-                <w:sz w:val="18"/>
-              </w:rPr>
-              <w:t>同名店铺合并；不同店铺使用各自的动态键。店铺缺失、null 或空字符串时取公司名。</w:t>
-            </w:r>
-          </w:p>
-        </w:tc>
-      </w:tr>
-      <w:tr>
-        <w:tc>
-          <w:tcPr>
-            <w:tcW w:type="dxa" w:w="2098"/>
-            <w:vAlign w:val="center"/>
-            <w:tcBorders>
-              <w:top w:val="single" w:sz="4" w:color="D9D9D9"/>
-              <w:left w:val="single" w:sz="4" w:color="D9D9D9"/>
-              <w:bottom w:val="single" w:sz="4" w:color="D9D9D9"/>
-              <w:right w:val="single" w:sz="4" w:color="D9D9D9"/>
-            </w:tcBorders>
-            <w:tcMar>
-              <w:top w:w="85" w:type="dxa"/>
-              <w:left w:w="85" w:type="dxa"/>
-              <w:bottom w:w="85" w:type="dxa"/>
-              <w:right w:w="85" w:type="dxa"/>
-            </w:tcMar>
-          </w:tcPr>
-          <w:p>
-            <w:pPr>
-              <w:spacing w:after="40" w:before="40"/>
-            </w:pPr>
-            <w:r>
-              <w:rPr>
-                <w:b w:val="0"/>
-                <w:sz w:val="18"/>
-              </w:rPr>
-              <w:t>站点</w:t>
-            </w:r>
-          </w:p>
-        </w:tc>
-        <w:tc>
-          <w:tcPr>
-            <w:tcW w:type="dxa" w:w="7540"/>
-            <w:vAlign w:val="center"/>
-            <w:tcBorders>
-              <w:top w:val="single" w:sz="4" w:color="D9D9D9"/>
-              <w:left w:val="single" w:sz="4" w:color="D9D9D9"/>
-              <w:bottom w:val="single" w:sz="4" w:color="D9D9D9"/>
-              <w:right w:val="single" w:sz="4" w:color="D9D9D9"/>
-            </w:tcBorders>
-            <w:tcMar>
-              <w:top w:w="85" w:type="dxa"/>
-              <w:left w:w="85" w:type="dxa"/>
-              <w:bottom w:w="85" w:type="dxa"/>
-              <w:right w:w="85" w:type="dxa"/>
-            </w:tcMar>
-          </w:tcPr>
-          <w:p>
-            <w:pPr>
-              <w:spacing w:after="40" w:before="40"/>
-            </w:pPr>
-            <w:r>
-              <w:rPr>
-                <w:b w:val="0"/>
-                <w:sz w:val="18"/>
-              </w:rPr>
-              <w:t>按站点 name 去重，保留首次出现顺序；缺失或 null 视为空列表。</w:t>
-            </w:r>
-          </w:p>
-        </w:tc>
-      </w:tr>
-      <w:tr>
-        <w:tc>
-          <w:tcPr>
-            <w:tcW w:type="dxa" w:w="2098"/>
-            <w:vAlign w:val="center"/>
-            <w:tcBorders>
-              <w:top w:val="single" w:sz="4" w:color="D9D9D9"/>
-              <w:left w:val="single" w:sz="4" w:color="D9D9D9"/>
-              <w:bottom w:val="single" w:sz="4" w:color="D9D9D9"/>
-              <w:right w:val="single" w:sz="4" w:color="D9D9D9"/>
-            </w:tcBorders>
-            <w:tcMar>
-              <w:top w:w="85" w:type="dxa"/>
-              <w:left w:w="85" w:type="dxa"/>
-              <w:bottom w:w="85" w:type="dxa"/>
-              <w:right w:w="85" w:type="dxa"/>
-            </w:tcMar>
-          </w:tcPr>
-          <w:p>
-            <w:pPr>
-              <w:spacing w:after="40" w:before="40"/>
-            </w:pPr>
-            <w:r>
-              <w:rPr>
-                <w:b w:val="0"/>
-                <w:sz w:val="18"/>
-              </w:rPr>
-              <w:t>负责人</w:t>
-            </w:r>
-          </w:p>
-        </w:tc>
-        <w:tc>
-          <w:tcPr>
-            <w:tcW w:type="dxa" w:w="7540"/>
-            <w:vAlign w:val="center"/>
-            <w:tcBorders>
-              <w:top w:val="single" w:sz="4" w:color="D9D9D9"/>
-              <w:left w:val="single" w:sz="4" w:color="D9D9D9"/>
-              <w:bottom w:val="single" w:sz="4" w:color="D9D9D9"/>
-              <w:right w:val="single" w:sz="4" w:color="D9D9D9"/>
-            </w:tcBorders>
-            <w:tcMar>
-              <w:top w:w="85" w:type="dxa"/>
-              <w:left w:w="85" w:type="dxa"/>
-              <w:bottom w:w="85" w:type="dxa"/>
-              <w:right w:w="85" w:type="dxa"/>
-            </w:tcMar>
-          </w:tcPr>
-          <w:p>
-            <w:pPr>
-              <w:spacing w:after="40" w:before="40"/>
-            </w:pPr>
-            <w:r>
-              <w:rPr>
-                <w:b w:val="0"/>
-                <w:sz w:val="18"/>
-              </w:rPr>
-              <w:t>按 unionId 与 name 的组合去重，两个列表按下标一一对应。相同 ID 不同姓名保留两组。</w:t>
-            </w:r>
-          </w:p>
-        </w:tc>
-      </w:tr>
-      <w:tr>
-        <w:tc>
-          <w:tcPr>
-            <w:tcW w:type="dxa" w:w="2098"/>
-            <w:vAlign w:val="center"/>
-            <w:tcBorders>
-              <w:top w:val="single" w:sz="4" w:color="D9D9D9"/>
-              <w:left w:val="single" w:sz="4" w:color="D9D9D9"/>
-              <w:bottom w:val="single" w:sz="4" w:color="D9D9D9"/>
-              <w:right w:val="single" w:sz="4" w:color="D9D9D9"/>
-            </w:tcBorders>
-            <w:tcMar>
-              <w:top w:w="85" w:type="dxa"/>
-              <w:left w:w="85" w:type="dxa"/>
-              <w:bottom w:w="85" w:type="dxa"/>
-              <w:right w:w="85" w:type="dxa"/>
-            </w:tcMar>
-          </w:tcPr>
-          <w:p>
-            <w:pPr>
-              <w:spacing w:after="40" w:before="40"/>
-            </w:pPr>
-            <w:r>
-              <w:rPr>
-                <w:b w:val="0"/>
-                <w:sz w:val="18"/>
-              </w:rPr>
-              <w:t>人员缺失字段</w:t>
-            </w:r>
-          </w:p>
-        </w:tc>
-        <w:tc>
-          <w:tcPr>
-            <w:tcW w:type="dxa" w:w="7540"/>
-            <w:vAlign w:val="center"/>
-            <w:tcBorders>
-              <w:top w:val="single" w:sz="4" w:color="D9D9D9"/>
-              <w:left w:val="single" w:sz="4" w:color="D9D9D9"/>
-              <w:bottom w:val="single" w:sz="4" w:color="D9D9D9"/>
-              <w:right w:val="single" w:sz="4" w:color="D9D9D9"/>
-            </w:tcBorders>
-            <w:tcMar>
-              <w:top w:w="85" w:type="dxa"/>
-              <w:left w:w="85" w:type="dxa"/>
-              <w:bottom w:w="85" w:type="dxa"/>
-              <w:right w:w="85" w:type="dxa"/>
-            </w:tcMar>
-          </w:tcPr>
-          <w:p>
-            <w:pPr>
-              <w:spacing w:after="40" w:before="40"/>
-            </w:pPr>
-            <w:r>
-              <w:rPr>
-                <w:b w:val="0"/>
-                <w:sz w:val="18"/>
-              </w:rPr>
-              <w:t>只有 ID 或姓名时保留，另一字段填空字符串；两者均为空时跳过。</w:t>
-            </w:r>
-          </w:p>
-        </w:tc>
-      </w:tr>
-      <w:tr>
-        <w:tc>
-          <w:tcPr>
-            <w:tcW w:type="dxa" w:w="2098"/>
-            <w:vAlign w:val="center"/>
-            <w:tcBorders>
-              <w:top w:val="single" w:sz="4" w:color="D9D9D9"/>
-              <w:left w:val="single" w:sz="4" w:color="D9D9D9"/>
-              <w:bottom w:val="single" w:sz="4" w:color="D9D9D9"/>
-              <w:right w:val="single" w:sz="4" w:color="D9D9D9"/>
-            </w:tcBorders>
-            <w:tcMar>
-              <w:top w:w="85" w:type="dxa"/>
-              <w:left w:w="85" w:type="dxa"/>
-              <w:bottom w:w="85" w:type="dxa"/>
-              <w:right w:w="85" w:type="dxa"/>
-            </w:tcMar>
-          </w:tcPr>
-          <w:p>
-            <w:pPr>
-              <w:spacing w:after="40" w:before="40"/>
-            </w:pPr>
-            <w:r>
-              <w:rPr>
-                <w:b w:val="0"/>
-                <w:sz w:val="18"/>
-              </w:rPr>
-              <w:t>空记录</w:t>
-            </w:r>
-          </w:p>
-        </w:tc>
-        <w:tc>
-          <w:tcPr>
-            <w:tcW w:type="dxa" w:w="7540"/>
-            <w:vAlign w:val="center"/>
-            <w:tcBorders>
-              <w:top w:val="single" w:sz="4" w:color="D9D9D9"/>
-              <w:left w:val="single" w:sz="4" w:color="D9D9D9"/>
-              <w:bottom w:val="single" w:sz="4" w:color="D9D9D9"/>
-              <w:right w:val="single" w:sz="4" w:color="D9D9D9"/>
-            </w:tcBorders>
-            <w:tcMar>
-              <w:top w:w="85" w:type="dxa"/>
-              <w:left w:w="85" w:type="dxa"/>
-              <w:bottom w:w="85" w:type="dxa"/>
-              <w:right w:w="85" w:type="dxa"/>
-            </w:tcMar>
-          </w:tcPr>
-          <w:p>
-            <w:pPr>
-              <w:spacing w:after="40" w:before="40"/>
-            </w:pPr>
-            <w:r>
-              <w:rPr>
-                <w:b w:val="0"/>
-                <w:sz w:val="18"/>
-              </w:rPr>
-              <w:t>fields 缺失、null 或空对象时跳过；非空 fields 的公司名必须非空白。</w:t>
-            </w:r>
-          </w:p>
-        </w:tc>
-      </w:tr>
-      <w:tr>
-        <w:tc>
-          <w:tcPr>
-            <w:tcW w:type="dxa" w:w="2098"/>
-            <w:vAlign w:val="center"/>
-            <w:tcBorders>
-              <w:top w:val="single" w:sz="4" w:color="D9D9D9"/>
-              <w:left w:val="single" w:sz="4" w:color="D9D9D9"/>
-              <w:bottom w:val="single" w:sz="4" w:color="D9D9D9"/>
-              <w:right w:val="single" w:sz="4" w:color="D9D9D9"/>
-            </w:tcBorders>
-            <w:tcMar>
-              <w:top w:w="85" w:type="dxa"/>
-              <w:left w:w="85" w:type="dxa"/>
-              <w:bottom w:w="85" w:type="dxa"/>
-              <w:right w:w="85" w:type="dxa"/>
-            </w:tcMar>
-          </w:tcPr>
-          <w:p>
-            <w:pPr>
-              <w:spacing w:after="40" w:before="40"/>
-            </w:pPr>
-            <w:r>
-              <w:rPr>
-                <w:b w:val="0"/>
-                <w:sz w:val="18"/>
-              </w:rPr>
-              <w:t>凭据缺失</w:t>
-            </w:r>
-          </w:p>
-        </w:tc>
-        <w:tc>
-          <w:tcPr>
-            <w:tcW w:type="dxa" w:w="7540"/>
-            <w:vAlign w:val="center"/>
-            <w:tcBorders>
-              <w:top w:val="single" w:sz="4" w:color="D9D9D9"/>
-              <w:left w:val="single" w:sz="4" w:color="D9D9D9"/>
-              <w:bottom w:val="single" w:sz="4" w:color="D9D9D9"/>
-              <w:right w:val="single" w:sz="4" w:color="D9D9D9"/>
-            </w:tcBorders>
-            <w:tcMar>
-              <w:top w:w="85" w:type="dxa"/>
-              <w:left w:w="85" w:type="dxa"/>
-              <w:bottom w:w="85" w:type="dxa"/>
-              <w:right w:w="85" w:type="dxa"/>
-            </w:tcMar>
-          </w:tcPr>
-          <w:p>
-            <w:pPr>
-              <w:spacing w:after="40" w:before="40"/>
-            </w:pPr>
-            <w:r>
-              <w:rPr>
-                <w:b w:val="0"/>
-                <w:sz w:val="18"/>
-              </w:rPr>
-              <w:t>用户名或密码缺失、null 时输出空字符串；需要凭据的下游应校验非空。</w:t>
-            </w:r>
-          </w:p>
-        </w:tc>
-      </w:tr>
-      <w:tr>
-        <w:tc>
-          <w:tcPr>
-            <w:tcW w:type="dxa" w:w="2098"/>
-            <w:vAlign w:val="center"/>
-            <w:tcBorders>
-              <w:top w:val="single" w:sz="4" w:color="D9D9D9"/>
-              <w:left w:val="single" w:sz="4" w:color="D9D9D9"/>
-              <w:bottom w:val="single" w:sz="4" w:color="D9D9D9"/>
-              <w:right w:val="single" w:sz="4" w:color="D9D9D9"/>
-            </w:tcBorders>
-            <w:tcMar>
-              <w:top w:w="85" w:type="dxa"/>
-              <w:left w:w="85" w:type="dxa"/>
-              <w:bottom w:w="85" w:type="dxa"/>
-              <w:right w:w="85" w:type="dxa"/>
-            </w:tcMar>
-          </w:tcPr>
-          <w:p>
-            <w:pPr>
-              <w:spacing w:after="40" w:before="40"/>
-            </w:pPr>
-            <w:r>
-              <w:rPr>
-                <w:b w:val="0"/>
-                <w:sz w:val="18"/>
-              </w:rPr>
-              <w:t>原始字符</w:t>
-            </w:r>
-          </w:p>
-        </w:tc>
-        <w:tc>
-          <w:tcPr>
-            <w:tcW w:type="dxa" w:w="7540"/>
-            <w:vAlign w:val="center"/>
-            <w:tcBorders>
-              <w:top w:val="single" w:sz="4" w:color="D9D9D9"/>
-              <w:left w:val="single" w:sz="4" w:color="D9D9D9"/>
-              <w:bottom w:val="single" w:sz="4" w:color="D9D9D9"/>
-              <w:right w:val="single" w:sz="4" w:color="D9D9D9"/>
-            </w:tcBorders>
-            <w:tcMar>
-              <w:top w:w="85" w:type="dxa"/>
-              <w:left w:w="85" w:type="dxa"/>
-              <w:bottom w:w="85" w:type="dxa"/>
-              <w:right w:w="85" w:type="dxa"/>
-            </w:tcMar>
-          </w:tcPr>
-          <w:p>
-            <w:pPr>
-              <w:spacing w:after="40" w:before="40"/>
-            </w:pPr>
-            <w:r>
-              <w:rPr>
-                <w:b w:val="0"/>
-                <w:sz w:val="18"/>
-              </w:rPr>
-              <w:t>不裁剪或改写非空字符串，密码空格、换行、特殊字符原样保留。</w:t>
-            </w:r>
-          </w:p>
-        </w:tc>
-      </w:tr>
-    </w:tbl>
-    <w:p>
-      <w:pPr>
-        <w:spacing w:after="0"/>
-      </w:pPr>
-    </w:p>
-    <w:p>
-      <w:r>
-        <w:t>公司、店铺和列表元素均按首次出现顺序输出。Python 字典的单引号显示形式与 JSON 双引号文件形式不同，但对应的数据结构相同。</w:t>
-      </w:r>
-    </w:p>
-    <w:p>
-      <w:pPr>
-        <w:pStyle w:val="Heading1"/>
-      </w:pPr>
-      <w:r>
-        <w:t>5 防止无声覆盖</w:t>
+        <w:t>8 归档前脱敏</w:t>
       </w:r>
     </w:p>
     <w:p>
       <w:r>
-        <w:t>若店铺名为“公司名”“企业用户名”或“企业密码”，动态店铺键会与元数据冲突，代码直接报错。请调整上游店铺名，不会自动改名或覆盖原字段。</w:t>
+        <w:t>推送到 GitHub 的示例使用虚构账号、密码、公司及人员标识。代码正常运行时保留业务值；归档脱敏不改变运行逻辑。每次上传前审阅文本、Word 正文及属性，并扫描暂存内容和待推送历史。</w:t>
       </w:r>
     </w:p>
     <w:p>
       <w:r>
-        <w:t>当同公司有多组账号或密码时，结果可能出现多个相同公司名。下游应进一步按账号匹配，不能仅按公司名覆盖。</w:t>
-      </w:r>
-    </w:p>
-    <w:p>
-      <w:r>
-        <w:t>schemas 中提供输入和输出 JSON Schema。公司名非空白、动态键冲突及人员两个列表等长由代码额外校验；JSON Schema 仅用于结构核对。</w:t>
-      </w:r>
-    </w:p>
-    <w:p>
-      <w:r>
-        <w:br w:type="page"/>
-      </w:r>
-    </w:p>
-    <w:p>
-      <w:pPr>
-        <w:pStyle w:val="Heading1"/>
-      </w:pPr>
-      <w:r>
-        <w:t>6 对象包装与分页</w:t>
-      </w:r>
-    </w:p>
-    <w:p>
-      <w:r>
-        <w:t>默认输入必须是记录列表。如果实际返回值确实采用下面的对象包装，可用显式路径提取；路径仅为说明示例，请以节点实际返回值为准。</w:t>
-      </w:r>
-    </w:p>
-    <w:p>
-      <w:pPr>
-        <w:spacing w:line="252" w:lineRule="auto"/>
-        <w:ind w:left="113"/>
-      </w:pPr>
-      <w:r>
-        <w:rPr>
-          <w:rFonts w:ascii="Consolas" w:hAnsi="Consolas" w:eastAsia="Microsoft YaHei"/>
-          <w:sz w:val="18"/>
-        </w:rPr>
-        <w:t># 假设输入形状为 {"data": {"records": [...]}}</w:t>
-        <w:br/>
-        <w:t>records = extract_records(iPaas_result, ["data", "records"])</w:t>
-        <w:br/>
-        <w:t>result = transform(records)</w:t>
-      </w:r>
-    </w:p>
-    <w:p>
-      <w:r>
-        <w:t>将这两行替换直接执行式文件末尾的单行调用。函数式入口则用同样的提取步骤，在末尾返回 {"result": transform(records)}。转换函数不猜测字段路径，也不接收打印后的字符串。</w:t>
-      </w:r>
-    </w:p>
-    <w:p>
-      <w:r>
-        <w:t>函数只处理传入的记录。若上游分页，请先收集所有需要的页面并拼接记录列表，再转换一次；逐页转换后直接拼接会让跨页公司或店铺重复。</w:t>
-      </w:r>
-    </w:p>
-    <w:p>
-      <w:pPr>
-        <w:pStyle w:val="Heading1"/>
-      </w:pPr>
-      <w:r>
-        <w:t>7 排查错误</w:t>
-      </w:r>
-    </w:p>
-    <w:tbl>
-      <w:tblPr>
-        <w:tblW w:type="auto" w:w="0"/>
-        <w:tblLayout w:type="fixed"/>
-        <w:tblLook w:firstColumn="1" w:firstRow="1" w:lastColumn="0" w:lastRow="0" w:noHBand="0" w:noVBand="1" w:val="04A0"/>
-      </w:tblPr>
-      <w:tblGrid>
-        <w:gridCol w:w="2608"/>
-        <w:gridCol w:w="7030"/>
-      </w:tblGrid>
-      <w:tr>
-        <w:trPr>
-          <w:tblHeader/>
-        </w:trPr>
-        <w:tc>
-          <w:tcPr>
-            <w:tcW w:type="dxa" w:w="2608"/>
-            <w:vAlign w:val="center"/>
-            <w:tcBorders>
-              <w:top w:val="single" w:sz="4" w:color="D9D9D9"/>
-              <w:left w:val="single" w:sz="4" w:color="D9D9D9"/>
-              <w:bottom w:val="single" w:sz="4" w:color="D9D9D9"/>
-              <w:right w:val="single" w:sz="4" w:color="D9D9D9"/>
-            </w:tcBorders>
-            <w:tcMar>
-              <w:top w:w="85" w:type="dxa"/>
-              <w:left w:w="85" w:type="dxa"/>
-              <w:bottom w:w="85" w:type="dxa"/>
-              <w:right w:w="85" w:type="dxa"/>
-            </w:tcMar>
-            <w:shd w:fill="E8EEF4"/>
-          </w:tcPr>
-          <w:p>
-            <w:pPr>
-              <w:spacing w:after="40" w:before="40"/>
-            </w:pPr>
-            <w:r>
-              <w:rPr>
-                <w:b/>
-                <w:sz w:val="18"/>
-              </w:rPr>
-              <w:t>现象</w:t>
-            </w:r>
-          </w:p>
-        </w:tc>
-        <w:tc>
-          <w:tcPr>
-            <w:tcW w:type="dxa" w:w="7030"/>
-            <w:vAlign w:val="center"/>
-            <w:tcBorders>
-              <w:top w:val="single" w:sz="4" w:color="D9D9D9"/>
-              <w:left w:val="single" w:sz="4" w:color="D9D9D9"/>
-              <w:bottom w:val="single" w:sz="4" w:color="D9D9D9"/>
-              <w:right w:val="single" w:sz="4" w:color="D9D9D9"/>
-            </w:tcBorders>
-            <w:tcMar>
-              <w:top w:w="85" w:type="dxa"/>
-              <w:left w:w="85" w:type="dxa"/>
-              <w:bottom w:w="85" w:type="dxa"/>
-              <w:right w:w="85" w:type="dxa"/>
-            </w:tcMar>
-            <w:shd w:fill="E8EEF4"/>
-          </w:tcPr>
-          <w:p>
-            <w:pPr>
-              <w:spacing w:after="40" w:before="40"/>
-            </w:pPr>
-            <w:r>
-              <w:rPr>
-                <w:b/>
-                <w:sz w:val="18"/>
-              </w:rPr>
-              <w:t>处理方式</w:t>
-            </w:r>
-          </w:p>
-        </w:tc>
-      </w:tr>
-      <w:tr>
-        <w:tc>
-          <w:tcPr>
-            <w:tcW w:type="dxa" w:w="2608"/>
-            <w:vAlign w:val="center"/>
-            <w:tcBorders>
-              <w:top w:val="single" w:sz="4" w:color="D9D9D9"/>
-              <w:left w:val="single" w:sz="4" w:color="D9D9D9"/>
-              <w:bottom w:val="single" w:sz="4" w:color="D9D9D9"/>
-              <w:right w:val="single" w:sz="4" w:color="D9D9D9"/>
-            </w:tcBorders>
-            <w:tcMar>
-              <w:top w:w="85" w:type="dxa"/>
-              <w:left w:w="85" w:type="dxa"/>
-              <w:bottom w:w="85" w:type="dxa"/>
-              <w:right w:w="85" w:type="dxa"/>
-            </w:tcMar>
-          </w:tcPr>
-          <w:p>
-            <w:pPr>
-              <w:spacing w:after="40" w:before="40"/>
-            </w:pPr>
-            <w:r>
-              <w:rPr>
-                <w:b w:val="0"/>
-                <w:sz w:val="18"/>
-              </w:rPr>
-              <w:t>iPaas_result 未定义</w:t>
-            </w:r>
-          </w:p>
-        </w:tc>
-        <w:tc>
-          <w:tcPr>
-            <w:tcW w:type="dxa" w:w="7030"/>
-            <w:vAlign w:val="center"/>
-            <w:tcBorders>
-              <w:top w:val="single" w:sz="4" w:color="D9D9D9"/>
-              <w:left w:val="single" w:sz="4" w:color="D9D9D9"/>
-              <w:bottom w:val="single" w:sz="4" w:color="D9D9D9"/>
-              <w:right w:val="single" w:sz="4" w:color="D9D9D9"/>
-            </w:tcBorders>
-            <w:tcMar>
-              <w:top w:w="85" w:type="dxa"/>
-              <w:left w:w="85" w:type="dxa"/>
-              <w:bottom w:w="85" w:type="dxa"/>
-              <w:right w:w="85" w:type="dxa"/>
-            </w:tcMar>
-          </w:tcPr>
-          <w:p>
-            <w:pPr>
-              <w:spacing w:after="40" w:before="40"/>
-            </w:pPr>
-            <w:r>
-              <w:rPr>
-                <w:b w:val="0"/>
-                <w:sz w:val="18"/>
-              </w:rPr>
-              <w:t>检查代码节点输入映射及参数名。</w:t>
-            </w:r>
-          </w:p>
-        </w:tc>
-      </w:tr>
-      <w:tr>
-        <w:tc>
-          <w:tcPr>
-            <w:tcW w:type="dxa" w:w="2608"/>
-            <w:vAlign w:val="center"/>
-            <w:tcBorders>
-              <w:top w:val="single" w:sz="4" w:color="D9D9D9"/>
-              <w:left w:val="single" w:sz="4" w:color="D9D9D9"/>
-              <w:bottom w:val="single" w:sz="4" w:color="D9D9D9"/>
-              <w:right w:val="single" w:sz="4" w:color="D9D9D9"/>
-            </w:tcBorders>
-            <w:tcMar>
-              <w:top w:w="85" w:type="dxa"/>
-              <w:left w:w="85" w:type="dxa"/>
-              <w:bottom w:w="85" w:type="dxa"/>
-              <w:right w:w="85" w:type="dxa"/>
-            </w:tcMar>
-          </w:tcPr>
-          <w:p>
-            <w:pPr>
-              <w:spacing w:after="40" w:before="40"/>
-            </w:pPr>
-            <w:r>
-              <w:rPr>
-                <w:b w:val="0"/>
-                <w:sz w:val="18"/>
-              </w:rPr>
-              <w:t>记录数据必须是列表</w:t>
-            </w:r>
-          </w:p>
-        </w:tc>
-        <w:tc>
-          <w:tcPr>
-            <w:tcW w:type="dxa" w:w="7030"/>
-            <w:vAlign w:val="center"/>
-            <w:tcBorders>
-              <w:top w:val="single" w:sz="4" w:color="D9D9D9"/>
-              <w:left w:val="single" w:sz="4" w:color="D9D9D9"/>
-              <w:bottom w:val="single" w:sz="4" w:color="D9D9D9"/>
-              <w:right w:val="single" w:sz="4" w:color="D9D9D9"/>
-            </w:tcBorders>
-            <w:tcMar>
-              <w:top w:w="85" w:type="dxa"/>
-              <w:left w:w="85" w:type="dxa"/>
-              <w:bottom w:w="85" w:type="dxa"/>
-              <w:right w:w="85" w:type="dxa"/>
-            </w:tcMar>
-          </w:tcPr>
-          <w:p>
-            <w:pPr>
-              <w:spacing w:after="40" w:before="40"/>
-            </w:pPr>
-            <w:r>
-              <w:rPr>
-                <w:b w:val="0"/>
-                <w:sz w:val="18"/>
-              </w:rPr>
-              <w:t>绑定真实记录列表，或显式提取对象中的列表路径。</w:t>
-            </w:r>
-          </w:p>
-        </w:tc>
-      </w:tr>
-      <w:tr>
-        <w:tc>
-          <w:tcPr>
-            <w:tcW w:type="dxa" w:w="2608"/>
-            <w:vAlign w:val="center"/>
-            <w:tcBorders>
-              <w:top w:val="single" w:sz="4" w:color="D9D9D9"/>
-              <w:left w:val="single" w:sz="4" w:color="D9D9D9"/>
-              <w:bottom w:val="single" w:sz="4" w:color="D9D9D9"/>
-              <w:right w:val="single" w:sz="4" w:color="D9D9D9"/>
-            </w:tcBorders>
-            <w:tcMar>
-              <w:top w:w="85" w:type="dxa"/>
-              <w:left w:w="85" w:type="dxa"/>
-              <w:bottom w:w="85" w:type="dxa"/>
-              <w:right w:w="85" w:type="dxa"/>
-            </w:tcMar>
-          </w:tcPr>
-          <w:p>
-            <w:pPr>
-              <w:spacing w:after="40" w:before="40"/>
-            </w:pPr>
-            <w:r>
-              <w:rPr>
-                <w:b w:val="0"/>
-                <w:sz w:val="18"/>
-              </w:rPr>
-              <w:t>字段类型错误</w:t>
-            </w:r>
-          </w:p>
-        </w:tc>
-        <w:tc>
-          <w:tcPr>
-            <w:tcW w:type="dxa" w:w="7030"/>
-            <w:vAlign w:val="center"/>
-            <w:tcBorders>
-              <w:top w:val="single" w:sz="4" w:color="D9D9D9"/>
-              <w:left w:val="single" w:sz="4" w:color="D9D9D9"/>
-              <w:bottom w:val="single" w:sz="4" w:color="D9D9D9"/>
-              <w:right w:val="single" w:sz="4" w:color="D9D9D9"/>
-            </w:tcBorders>
-            <w:tcMar>
-              <w:top w:w="85" w:type="dxa"/>
-              <w:left w:w="85" w:type="dxa"/>
-              <w:bottom w:w="85" w:type="dxa"/>
-              <w:right w:w="85" w:type="dxa"/>
-            </w:tcMar>
-          </w:tcPr>
-          <w:p>
-            <w:pPr>
-              <w:spacing w:after="40" w:before="40"/>
-            </w:pPr>
-            <w:r>
-              <w:rPr>
-                <w:b w:val="0"/>
-                <w:sz w:val="18"/>
-              </w:rPr>
-              <w:t>按错误中的 records 下标与字段位置修复输入，不对非法数据静默丢弃。</w:t>
-            </w:r>
-          </w:p>
-        </w:tc>
-      </w:tr>
-      <w:tr>
-        <w:tc>
-          <w:tcPr>
-            <w:tcW w:type="dxa" w:w="2608"/>
-            <w:vAlign w:val="center"/>
-            <w:tcBorders>
-              <w:top w:val="single" w:sz="4" w:color="D9D9D9"/>
-              <w:left w:val="single" w:sz="4" w:color="D9D9D9"/>
-              <w:bottom w:val="single" w:sz="4" w:color="D9D9D9"/>
-              <w:right w:val="single" w:sz="4" w:color="D9D9D9"/>
-            </w:tcBorders>
-            <w:tcMar>
-              <w:top w:w="85" w:type="dxa"/>
-              <w:left w:w="85" w:type="dxa"/>
-              <w:bottom w:w="85" w:type="dxa"/>
-              <w:right w:w="85" w:type="dxa"/>
-            </w:tcMar>
-          </w:tcPr>
-          <w:p>
-            <w:pPr>
-              <w:spacing w:after="40" w:before="40"/>
-            </w:pPr>
-            <w:r>
-              <w:rPr>
-                <w:b w:val="0"/>
-                <w:sz w:val="18"/>
-              </w:rPr>
-              <w:t>结果少于原始条数</w:t>
-            </w:r>
-          </w:p>
-        </w:tc>
-        <w:tc>
-          <w:tcPr>
-            <w:tcW w:type="dxa" w:w="7030"/>
-            <w:vAlign w:val="center"/>
-            <w:tcBorders>
-              <w:top w:val="single" w:sz="4" w:color="D9D9D9"/>
-              <w:left w:val="single" w:sz="4" w:color="D9D9D9"/>
-              <w:bottom w:val="single" w:sz="4" w:color="D9D9D9"/>
-              <w:right w:val="single" w:sz="4" w:color="D9D9D9"/>
-            </w:tcBorders>
-            <w:tcMar>
-              <w:top w:w="85" w:type="dxa"/>
-              <w:left w:w="85" w:type="dxa"/>
-              <w:bottom w:w="85" w:type="dxa"/>
-              <w:right w:w="85" w:type="dxa"/>
-            </w:tcMar>
-          </w:tcPr>
-          <w:p>
-            <w:pPr>
-              <w:spacing w:after="40" w:before="40"/>
-            </w:pPr>
-            <w:r>
-              <w:rPr>
-                <w:b w:val="0"/>
-                <w:sz w:val="18"/>
-              </w:rPr>
-              <w:t>核对空记录跳过、公司账号合并、同店铺去重是否符合预期。</w:t>
-            </w:r>
-          </w:p>
-        </w:tc>
-      </w:tr>
-      <w:tr>
-        <w:tc>
-          <w:tcPr>
-            <w:tcW w:type="dxa" w:w="2608"/>
-            <w:vAlign w:val="center"/>
-            <w:tcBorders>
-              <w:top w:val="single" w:sz="4" w:color="D9D9D9"/>
-              <w:left w:val="single" w:sz="4" w:color="D9D9D9"/>
-              <w:bottom w:val="single" w:sz="4" w:color="D9D9D9"/>
-              <w:right w:val="single" w:sz="4" w:color="D9D9D9"/>
-            </w:tcBorders>
-            <w:tcMar>
-              <w:top w:w="85" w:type="dxa"/>
-              <w:left w:w="85" w:type="dxa"/>
-              <w:bottom w:w="85" w:type="dxa"/>
-              <w:right w:w="85" w:type="dxa"/>
-            </w:tcMar>
-          </w:tcPr>
-          <w:p>
-            <w:pPr>
-              <w:spacing w:after="40" w:before="40"/>
-            </w:pPr>
-            <w:r>
-              <w:rPr>
-                <w:b w:val="0"/>
-                <w:sz w:val="18"/>
-              </w:rPr>
-              <w:t>节点没有输出</w:t>
-            </w:r>
-          </w:p>
-        </w:tc>
-        <w:tc>
-          <w:tcPr>
-            <w:tcW w:type="dxa" w:w="7030"/>
-            <w:vAlign w:val="center"/>
-            <w:tcBorders>
-              <w:top w:val="single" w:sz="4" w:color="D9D9D9"/>
-              <w:left w:val="single" w:sz="4" w:color="D9D9D9"/>
-              <w:bottom w:val="single" w:sz="4" w:color="D9D9D9"/>
-              <w:right w:val="single" w:sz="4" w:color="D9D9D9"/>
-            </w:tcBorders>
-            <w:tcMar>
-              <w:top w:w="85" w:type="dxa"/>
-              <w:left w:w="85" w:type="dxa"/>
-              <w:bottom w:w="85" w:type="dxa"/>
-              <w:right w:w="85" w:type="dxa"/>
-            </w:tcMar>
-          </w:tcPr>
-          <w:p>
-            <w:pPr>
-              <w:spacing w:after="40" w:before="40"/>
-            </w:pPr>
-            <w:r>
-              <w:rPr>
-                <w:b w:val="0"/>
-                <w:sz w:val="18"/>
-              </w:rPr>
-              <w:t>核对平台要求的函数返回方式及 result 输出声明。</w:t>
-            </w:r>
-          </w:p>
-        </w:tc>
-      </w:tr>
-    </w:tbl>
-    <w:p>
-      <w:pPr>
-        <w:spacing w:after="0"/>
-      </w:pPr>
-    </w:p>
-    <w:p>
-      <w:pPr>
-        <w:pStyle w:val="Heading1"/>
-      </w:pPr>
-      <w:r>
-        <w:t>8 本地验收</w:t>
-      </w:r>
-    </w:p>
-    <w:p>
-      <w:pPr>
-        <w:spacing w:line="252" w:lineRule="auto"/>
-        <w:ind w:left="113"/>
-      </w:pPr>
-      <w:r>
-        <w:rPr>
-          <w:rFonts w:ascii="Consolas" w:hAnsi="Consolas" w:eastAsia="Microsoft YaHei"/>
-          <w:sz w:val="18"/>
-        </w:rPr>
-        <w:t># 在交付包目录内执行</w:t>
-        <w:br/>
-        <w:t>python -m unittest -v</w:t>
-      </w:r>
-    </w:p>
-    <w:p>
-      <w:r>
-        <w:t>测试使用 Python 标准库，覆盖分组、空记录、重复记录、人员对应关系、密码字符保留、输入不变、字段类型、动态键冲突和入口输出。执行结果见验收结果.txt。</w:t>
-      </w:r>
-    </w:p>
-    <w:p>
-      <w:r>
-        <w:t>示例共 10 条输入，含 1 条重复记录和 2 条空记录；预期得到 5 组公司账号和 7 家店铺。实际转换代码不打印数据，不发网络请求，不读取或写入文件。</w:t>
+        <w:t>自动扫描覆盖已定义模式，无法替代人工识别全部业务秘密。平台内的输入绑定、输出大小和执行时间限制仍需接入后确认；本地验证不等于已在钉钉环境联调。</w:t>
       </w:r>
     </w:p>
     <w:sectPr>
@@ -2491,7 +2420,7 @@
     <w:pPr>
       <w:keepNext/>
       <w:keepLines/>
-      <w:spacing w:before="180" w:after="120"/>
+      <w:spacing w:before="200" w:after="0"/>
       <w:outlineLvl w:val="1"/>
     </w:pPr>
     <w:rPr>
@@ -2499,7 +2428,7 @@
       <w:b/>
       <w:bCs/>
       <w:color w:val="000000"/>
-      <w:sz w:val="24"/>
+      <w:sz w:val="26"/>
       <w:szCs w:val="26"/>
     </w:rPr>
   </w:style>

</xml_diff>